<commit_message>
final trd and prd completed
</commit_message>
<xml_diff>
--- a/Smartchef PRD.docx
+++ b/Smartchef PRD.docx
@@ -1,13 +1,13 @@
 
 <file path=word/document.xml><?xml version="1.0" encoding="utf-8"?>
-<w:document xmlns:w="http://schemas.openxmlformats.org/wordprocessingml/2006/main" xmlns:r="http://schemas.openxmlformats.org/officeDocument/2006/relationships" xmlns:wp="http://schemas.openxmlformats.org/drawingml/2006/wordprocessingDrawing" xmlns:a="http://schemas.openxmlformats.org/drawingml/2006/main" xmlns:pic="http://schemas.openxmlformats.org/drawingml/2006/picture">
+<w:document xmlns:wpc="http://schemas.microsoft.com/office/word/2010/wordprocessingCanvas" xmlns:cx="http://schemas.microsoft.com/office/drawing/2014/chartex" xmlns:cx1="http://schemas.microsoft.com/office/drawing/2015/9/8/chartex" xmlns:cx2="http://schemas.microsoft.com/office/drawing/2015/10/21/chartex" xmlns:cx3="http://schemas.microsoft.com/office/drawing/2016/5/9/chartex" xmlns:cx4="http://schemas.microsoft.com/office/drawing/2016/5/10/chartex" xmlns:cx5="http://schemas.microsoft.com/office/drawing/2016/5/11/chartex" xmlns:cx6="http://schemas.microsoft.com/office/drawing/2016/5/12/chartex" xmlns:cx7="http://schemas.microsoft.com/office/drawing/2016/5/13/chartex" xmlns:cx8="http://schemas.microsoft.com/office/drawing/2016/5/14/chartex" xmlns:mc="http://schemas.openxmlformats.org/markup-compatibility/2006" xmlns:aink="http://schemas.microsoft.com/office/drawing/2016/ink" xmlns:am3d="http://schemas.microsoft.com/office/drawing/2017/model3d" xmlns:o="urn:schemas-microsoft-com:office:office" xmlns:oel="http://schemas.microsoft.com/office/2019/extlst" xmlns:r="http://schemas.openxmlformats.org/officeDocument/2006/relationships" xmlns:m="http://schemas.openxmlformats.org/officeDocument/2006/math" xmlns:v="urn:schemas-microsoft-com:vml" xmlns:wp14="http://schemas.microsoft.com/office/word/2010/wordprocessingDrawing" xmlns:wp="http://schemas.openxmlformats.org/drawingml/2006/wordprocessingDrawing" xmlns:w10="urn:schemas-microsoft-com:office:word" xmlns:w="http://schemas.openxmlformats.org/wordprocessingml/2006/main" xmlns:w14="http://schemas.microsoft.com/office/word/2010/wordml" xmlns:w15="http://schemas.microsoft.com/office/word/2012/wordml" xmlns:w16cex="http://schemas.microsoft.com/office/word/2018/wordml/cex" xmlns:w16cid="http://schemas.microsoft.com/office/word/2016/wordml/cid" xmlns:w16="http://schemas.microsoft.com/office/word/2018/wordml" xmlns:w16du="http://schemas.microsoft.com/office/word/2023/wordml/word16du" xmlns:w16sdtdh="http://schemas.microsoft.com/office/word/2020/wordml/sdtdatahash" xmlns:w16sdtfl="http://schemas.microsoft.com/office/word/2024/wordml/sdtformatlock" xmlns:w16se="http://schemas.microsoft.com/office/word/2015/wordml/symex" xmlns:wpg="http://schemas.microsoft.com/office/word/2010/wordprocessingGroup" xmlns:wpi="http://schemas.microsoft.com/office/word/2010/wordprocessingInk" xmlns:wne="http://schemas.microsoft.com/office/word/2006/wordml" xmlns:wps="http://schemas.microsoft.com/office/word/2010/wordprocessingShape" mc:Ignorable="w14 w15 w16se w16cid w16 w16cex w16sdtdh w16sdtfl w16du wp14">
   <w:body>
     <w:p>
       <w:pPr>
         <w:pStyle w:val="Heading1"/>
       </w:pPr>
       <w:r>
-        <w:t xml:space="preserve">Product Requirements Document (PRD)</w:t>
+        <w:t>Product Requirements Document (PRD)</w:t>
       </w:r>
     </w:p>
     <w:p>
@@ -15,16 +15,23 @@
         <w:pStyle w:val="Heading2"/>
       </w:pPr>
       <w:r>
-        <w:t xml:space="preserve">Project: SmartChef — AI-Powered Recipe &amp; Meal Planning Assistant</w:t>
-      </w:r>
-    </w:p>
-    <w:p>
-      <w:pPr/>
+        <w:t xml:space="preserve">Project: </w:t>
+      </w:r>
+      <w:proofErr w:type="spellStart"/>
+      <w:r>
+        <w:t>SmartChef</w:t>
+      </w:r>
+      <w:proofErr w:type="spellEnd"/>
+      <w:r>
+        <w:t xml:space="preserve"> — AI-Powered Recipe &amp; Meal Planning Assistant</w:t>
+      </w:r>
+    </w:p>
+    <w:p>
       <w:r>
         <w:rPr>
           <w:b/>
         </w:rPr>
-        <w:t xml:space="preserve">Version:</w:t>
+        <w:t>Version:</w:t>
       </w:r>
       <w:r>
         <w:t xml:space="preserve"> 2.0 (React frontend + image search) </w:t>
@@ -33,19 +40,33 @@
         <w:rPr>
           <w:b/>
         </w:rPr>
-        <w:t xml:space="preserve">Author:</w:t>
-      </w:r>
-      <w:r>
-        <w:t xml:space="preserve"> [Your Name] </w:t>
+        <w:t>Author:</w:t>
+      </w:r>
+      <w:r>
+        <w:t xml:space="preserve"> </w:t>
+      </w:r>
+      <w:proofErr w:type="spellStart"/>
+      <w:r>
+        <w:t>SmartChef</w:t>
+      </w:r>
+      <w:proofErr w:type="spellEnd"/>
+      <w:r>
+        <w:t xml:space="preserve"> Team</w:t>
+      </w:r>
+      <w:r>
+        <w:t xml:space="preserve"> </w:t>
       </w:r>
       <w:r>
         <w:rPr>
           <w:b/>
         </w:rPr>
-        <w:t xml:space="preserve">Date:</w:t>
-      </w:r>
-      <w:r>
-        <w:t xml:space="preserve"> [Submission Date]</w:t>
+        <w:t>Date:</w:t>
+      </w:r>
+      <w:r>
+        <w:t xml:space="preserve"> </w:t>
+      </w:r>
+      <w:r>
+        <w:t>16/10/2026</w:t>
       </w:r>
     </w:p>
     <w:p>
@@ -60,19 +81,22 @@
         <w:pStyle w:val="Heading2"/>
       </w:pPr>
       <w:r>
-        <w:t xml:space="preserve">1. Purpose &amp; Overview</w:t>
-      </w:r>
-    </w:p>
-    <w:p>
-      <w:pPr/>
-      <w:r>
-        <w:t xml:space="preserve">SmartChef is a web application that helps users decide what to cook using the ingredients they already have at home. The user enters a list of ingredients (and optional dietary preferences), and the app uses an LLM (Large Language Model) API to generate personalized recipe suggestions, complete with steps, estimated cooking time, and nutritional notes. Each recipe is paired with a relevant photo pulled from a free image search API.</w:t>
-      </w:r>
-    </w:p>
-    <w:p>
-      <w:pPr/>
-      <w:r>
-        <w:t xml:space="preserve">The goal of this project is to demonstrate a full-stack web application that:</w:t>
+        <w:t>1. Purpose &amp; Overview</w:t>
+      </w:r>
+    </w:p>
+    <w:p>
+      <w:proofErr w:type="spellStart"/>
+      <w:r>
+        <w:t>SmartChef</w:t>
+      </w:r>
+      <w:proofErr w:type="spellEnd"/>
+      <w:r>
+        <w:t xml:space="preserve"> is a web application that helps users decide what to cook using the ingredients they already have at home. The user enters a list of ingredients (and optional dietary preferences), and the app uses an LLM (Large Language Model) API to generate personalized recipe suggestions, complete with steps, estimated cooking time, and nutritional notes. Each recipe is paired with a relevant photo pulled from a free image search API.</w:t>
+      </w:r>
+    </w:p>
+    <w:p>
+      <w:r>
+        <w:t>The goal of this project is to demonstrate a full-stack web application that:</w:t>
       </w:r>
     </w:p>
     <w:p>
@@ -84,7 +108,7 @@
         </w:numPr>
       </w:pPr>
       <w:r>
-        <w:t xml:space="preserve">Consumes an external AI/LLM API from a secure backend</w:t>
+        <w:t>Consumes an external AI/LLM API from a secure backend</w:t>
       </w:r>
     </w:p>
     <w:p>
@@ -96,7 +120,7 @@
         </w:numPr>
       </w:pPr>
       <w:r>
-        <w:t xml:space="preserve">Consumes a second external API (image search) to enrich results visually</w:t>
+        <w:t>Consumes a second external API (image search) to enrich results visually</w:t>
       </w:r>
     </w:p>
     <w:p>
@@ -108,7 +132,7 @@
         </w:numPr>
       </w:pPr>
       <w:r>
-        <w:t xml:space="preserve">Has a rich, responsive React-based frontend</w:t>
+        <w:t>Has a rich, responsive React-based frontend</w:t>
       </w:r>
     </w:p>
     <w:p>
@@ -120,7 +144,7 @@
         </w:numPr>
       </w:pPr>
       <w:r>
-        <w:t xml:space="preserve">Persists user data on the client (no database required)</w:t>
+        <w:t>Persists user data on the client (no database required)</w:t>
       </w:r>
     </w:p>
     <w:p>
@@ -132,7 +156,7 @@
         </w:numPr>
       </w:pPr>
       <w:r>
-        <w:t xml:space="preserve">Follows good engineering practices (validation, rate limiting, caching, error handling)</w:t>
+        <w:t>Follows good engineering practices (validation, rate limiting, caching, error handling)</w:t>
       </w:r>
     </w:p>
     <w:p>
@@ -147,13 +171,12 @@
         <w:pStyle w:val="Heading2"/>
       </w:pPr>
       <w:r>
-        <w:t xml:space="preserve">2. Problem Statement</w:t>
-      </w:r>
-    </w:p>
-    <w:p>
-      <w:pPr/>
-      <w:r>
-        <w:t xml:space="preserve">People often have ingredients at home but don't know what to cook with them, leading to food waste or repetitive meals. Existing recipe apps require exact recipe search rather than "what can I make with what I have," and most don't personalize for dietary restrictions in a conversational way.</w:t>
+        <w:t>2. Problem Statement</w:t>
+      </w:r>
+    </w:p>
+    <w:p>
+      <w:r>
+        <w:t>People often have ingredients at home but don't know what to cook with them, leading to food waste or repetitive meals. Existing recipe apps require exact recipe search rather than "what can I make with what I have," and most don't personalize for dietary restrictions in a conversational way.</w:t>
       </w:r>
     </w:p>
     <w:p>
@@ -168,7 +191,7 @@
         <w:pStyle w:val="Heading2"/>
       </w:pPr>
       <w:r>
-        <w:t xml:space="preserve">3. Target Users</w:t>
+        <w:t>3. Target Users</w:t>
       </w:r>
     </w:p>
     <w:p>
@@ -180,7 +203,7 @@
         </w:numPr>
       </w:pPr>
       <w:r>
-        <w:t xml:space="preserve">Students and working professionals who cook at home with limited time</w:t>
+        <w:t>Students and working professionals who cook at home with limited time</w:t>
       </w:r>
     </w:p>
     <w:p>
@@ -192,7 +215,7 @@
         </w:numPr>
       </w:pPr>
       <w:r>
-        <w:t xml:space="preserve">Home cooks looking to reduce food waste</w:t>
+        <w:t>Home cooks looking to reduce food waste</w:t>
       </w:r>
     </w:p>
     <w:p>
@@ -204,7 +227,7 @@
         </w:numPr>
       </w:pPr>
       <w:r>
-        <w:t xml:space="preserve">People with dietary restrictions (vegetarian, vegan, gluten-free, keto, etc.) who want quick, filtered suggestions</w:t>
+        <w:t>People with dietary restrictions (vegetarian, vegan, gluten-free, keto, etc.) who want quick, filtered suggestions</w:t>
       </w:r>
     </w:p>
     <w:p>
@@ -218,8 +241,13 @@
       <w:pPr>
         <w:pStyle w:val="Heading2"/>
       </w:pPr>
-      <w:r>
-        <w:t xml:space="preserve">4. Goals &amp; Objectives</w:t>
+    </w:p>
+    <w:p>
+      <w:pPr>
+        <w:pStyle w:val="Heading2"/>
+      </w:pPr>
+      <w:r>
+        <w:t>4. Goals &amp; Objectives</w:t>
       </w:r>
     </w:p>
     <w:tbl>
@@ -227,7 +255,7 @@
         <w:tblStyle w:val="TableGrid"/>
         <w:tblW w:w="0" w:type="auto"/>
         <w:tblLayout w:type="fixed"/>
-        <w:tblLook w:val="04A0" w:firstRow="1" w:lastRow="0" w:firstColumn="0" w:lastColumn="0" w:noHBand="0" w:noVBand="1"/>
+        <w:tblLook w:val="0420" w:firstRow="1" w:lastRow="0" w:firstColumn="0" w:lastColumn="0" w:noHBand="0" w:noVBand="1"/>
       </w:tblPr>
       <w:tblGrid>
         <w:gridCol w:w="4680"/>
@@ -243,9 +271,8 @@
             <w:shd w:val="clear" w:color="auto" w:fill="F2F2F2"/>
           </w:tcPr>
           <w:p>
-            <w:pPr/>
-            <w:r>
-              <w:t xml:space="preserve">Goal</w:t>
+            <w:r>
+              <w:t>Goal</w:t>
             </w:r>
           </w:p>
         </w:tc>
@@ -255,9 +282,8 @@
             <w:shd w:val="clear" w:color="auto" w:fill="F2F2F2"/>
           </w:tcPr>
           <w:p>
-            <w:pPr/>
-            <w:r>
-              <w:t xml:space="preserve">Description</w:t>
+            <w:r>
+              <w:t>Description</w:t>
             </w:r>
           </w:p>
         </w:tc>
@@ -268,20 +294,18 @@
             <w:tcW w:w="4680" w:type="dxa"/>
           </w:tcPr>
           <w:p>
-            <w:pPr/>
-            <w:r>
-              <w:t xml:space="preserve">G1</w:t>
-            </w:r>
-          </w:p>
-        </w:tc>
-        <w:tc>
-          <w:tcPr>
-            <w:tcW w:w="4680" w:type="dxa"/>
-          </w:tcPr>
-          <w:p>
-            <w:pPr/>
-            <w:r>
-              <w:t xml:space="preserve">Let users generate relevant recipes from a free-text ingredient list</w:t>
+            <w:r>
+              <w:t>G1</w:t>
+            </w:r>
+          </w:p>
+        </w:tc>
+        <w:tc>
+          <w:tcPr>
+            <w:tcW w:w="4680" w:type="dxa"/>
+          </w:tcPr>
+          <w:p>
+            <w:r>
+              <w:t>Let users generate relevant recipes from a free-text ingredient list</w:t>
             </w:r>
           </w:p>
         </w:tc>
@@ -292,20 +316,18 @@
             <w:tcW w:w="4680" w:type="dxa"/>
           </w:tcPr>
           <w:p>
-            <w:pPr/>
-            <w:r>
-              <w:t xml:space="preserve">G2</w:t>
-            </w:r>
-          </w:p>
-        </w:tc>
-        <w:tc>
-          <w:tcPr>
-            <w:tcW w:w="4680" w:type="dxa"/>
-          </w:tcPr>
-          <w:p>
-            <w:pPr/>
-            <w:r>
-              <w:t xml:space="preserve">Support dietary filters and serving-size scaling</w:t>
+            <w:r>
+              <w:t>G2</w:t>
+            </w:r>
+          </w:p>
+        </w:tc>
+        <w:tc>
+          <w:tcPr>
+            <w:tcW w:w="4680" w:type="dxa"/>
+          </w:tcPr>
+          <w:p>
+            <w:r>
+              <w:t>Support dietary filters and serving-size scaling</w:t>
             </w:r>
           </w:p>
         </w:tc>
@@ -316,20 +338,18 @@
             <w:tcW w:w="4680" w:type="dxa"/>
           </w:tcPr>
           <w:p>
-            <w:pPr/>
-            <w:r>
-              <w:t xml:space="preserve">G3</w:t>
-            </w:r>
-          </w:p>
-        </w:tc>
-        <w:tc>
-          <w:tcPr>
-            <w:tcW w:w="4680" w:type="dxa"/>
-          </w:tcPr>
-          <w:p>
-            <w:pPr/>
-            <w:r>
-              <w:t xml:space="preserve">Let users save/revisit favorite recipes without login or a database</w:t>
+            <w:r>
+              <w:t>G3</w:t>
+            </w:r>
+          </w:p>
+        </w:tc>
+        <w:tc>
+          <w:tcPr>
+            <w:tcW w:w="4680" w:type="dxa"/>
+          </w:tcPr>
+          <w:p>
+            <w:r>
+              <w:t>Let users save/revisit favorite recipes without login or a database</w:t>
             </w:r>
           </w:p>
         </w:tc>
@@ -340,20 +360,18 @@
             <w:tcW w:w="4680" w:type="dxa"/>
           </w:tcPr>
           <w:p>
-            <w:pPr/>
-            <w:r>
-              <w:t xml:space="preserve">G4</w:t>
-            </w:r>
-          </w:p>
-        </w:tc>
-        <w:tc>
-          <w:tcPr>
-            <w:tcW w:w="4680" w:type="dxa"/>
-          </w:tcPr>
-          <w:p>
-            <w:pPr/>
-            <w:r>
-              <w:t xml:space="preserve">Keep the app fast and cheap to run by minimizing redundant LLM calls</w:t>
+            <w:r>
+              <w:t>G4</w:t>
+            </w:r>
+          </w:p>
+        </w:tc>
+        <w:tc>
+          <w:tcPr>
+            <w:tcW w:w="4680" w:type="dxa"/>
+          </w:tcPr>
+          <w:p>
+            <w:r>
+              <w:t>Keep the app fast and cheap to run by minimizing redundant LLM calls</w:t>
             </w:r>
           </w:p>
         </w:tc>
@@ -364,20 +382,18 @@
             <w:tcW w:w="4680" w:type="dxa"/>
           </w:tcPr>
           <w:p>
-            <w:pPr/>
-            <w:r>
-              <w:t xml:space="preserve">G5</w:t>
-            </w:r>
-          </w:p>
-        </w:tc>
-        <w:tc>
-          <w:tcPr>
-            <w:tcW w:w="4680" w:type="dxa"/>
-          </w:tcPr>
-          <w:p>
-            <w:pPr/>
-            <w:r>
-              <w:t xml:space="preserve">Demonstrate secure API key handling (LLM key and image API key never exposed to the browser)</w:t>
+            <w:r>
+              <w:t>G5</w:t>
+            </w:r>
+          </w:p>
+        </w:tc>
+        <w:tc>
+          <w:tcPr>
+            <w:tcW w:w="4680" w:type="dxa"/>
+          </w:tcPr>
+          <w:p>
+            <w:r>
+              <w:t>Demonstrate secure API key handling (LLM key and image API key never exposed to the browser)</w:t>
             </w:r>
           </w:p>
         </w:tc>
@@ -388,20 +404,18 @@
             <w:tcW w:w="4680" w:type="dxa"/>
           </w:tcPr>
           <w:p>
-            <w:pPr/>
-            <w:r>
-              <w:t xml:space="preserve">G6</w:t>
-            </w:r>
-          </w:p>
-        </w:tc>
-        <w:tc>
-          <w:tcPr>
-            <w:tcW w:w="4680" w:type="dxa"/>
-          </w:tcPr>
-          <w:p>
-            <w:pPr/>
-            <w:r>
-              <w:t xml:space="preserve">Show each recipe with a relevant photo to make results feel polished and real</w:t>
+            <w:r>
+              <w:t>G6</w:t>
+            </w:r>
+          </w:p>
+        </w:tc>
+        <w:tc>
+          <w:tcPr>
+            <w:tcW w:w="4680" w:type="dxa"/>
+          </w:tcPr>
+          <w:p>
+            <w:r>
+              <w:t>Show each recipe with a relevant photo to make results feel polished and real</w:t>
             </w:r>
           </w:p>
         </w:tc>
@@ -419,7 +433,7 @@
         <w:pStyle w:val="Heading2"/>
       </w:pPr>
       <w:r>
-        <w:t xml:space="preserve">5. Scope</w:t>
+        <w:t>5. Scope</w:t>
       </w:r>
     </w:p>
     <w:p>
@@ -427,7 +441,7 @@
         <w:pStyle w:val="Heading3"/>
       </w:pPr>
       <w:r>
-        <w:t xml:space="preserve">In Scope</w:t>
+        <w:t>In Scope</w:t>
       </w:r>
     </w:p>
     <w:p>
@@ -439,7 +453,7 @@
         </w:numPr>
       </w:pPr>
       <w:r>
-        <w:t xml:space="preserve">Ingredient-based recipe generation via LLM API</w:t>
+        <w:t>Ingredient-based recipe generation via LLM API</w:t>
       </w:r>
     </w:p>
     <w:p>
@@ -451,7 +465,7 @@
         </w:numPr>
       </w:pPr>
       <w:r>
-        <w:t xml:space="preserve">Dietary preference filters (vegetarian, vegan, gluten-free, keto, none)</w:t>
+        <w:t>Dietary preference filters (vegetarian, vegan, gluten-free, keto, none)</w:t>
       </w:r>
     </w:p>
     <w:p>
@@ -463,7 +477,7 @@
         </w:numPr>
       </w:pPr>
       <w:r>
-        <w:t xml:space="preserve">Serving size adjustment</w:t>
+        <w:t>Serving size adjustment</w:t>
       </w:r>
     </w:p>
     <w:p>
@@ -475,7 +489,23 @@
         </w:numPr>
       </w:pPr>
       <w:r>
-        <w:t xml:space="preserve">Recipe photo per result, fetched via a free image search API (Unsplash or Pexels)</w:t>
+        <w:t>Recipe photo per result, fetched via a free image search API (</w:t>
+      </w:r>
+      <w:proofErr w:type="spellStart"/>
+      <w:r>
+        <w:t>Unsplash</w:t>
+      </w:r>
+      <w:proofErr w:type="spellEnd"/>
+      <w:r>
+        <w:t xml:space="preserve"> or </w:t>
+      </w:r>
+      <w:proofErr w:type="spellStart"/>
+      <w:r>
+        <w:t>Pexels</w:t>
+      </w:r>
+      <w:proofErr w:type="spellEnd"/>
+      <w:r>
+        <w:t>)</w:t>
       </w:r>
     </w:p>
     <w:p>
@@ -489,14 +519,16 @@
       <w:r>
         <w:t xml:space="preserve">Save/remove favorite recipes (stored in browser </w:t>
       </w:r>
+      <w:proofErr w:type="spellStart"/>
       <w:r>
         <w:rPr>
           <w:rStyle w:val="CodeChar"/>
         </w:rPr>
-        <w:t xml:space="preserve">localStorage</w:t>
-      </w:r>
-      <w:r>
-        <w:t xml:space="preserve">)</w:t>
+        <w:t>localStorage</w:t>
+      </w:r>
+      <w:proofErr w:type="spellEnd"/>
+      <w:r>
+        <w:t>)</w:t>
       </w:r>
     </w:p>
     <w:p>
@@ -508,7 +540,15 @@
         </w:numPr>
       </w:pPr>
       <w:r>
-        <w:t xml:space="preserve">Recent search history (localStorage)</w:t>
+        <w:t>Recent search history (</w:t>
+      </w:r>
+      <w:proofErr w:type="spellStart"/>
+      <w:r>
+        <w:t>localStorage</w:t>
+      </w:r>
+      <w:proofErr w:type="spellEnd"/>
+      <w:r>
+        <w:t>)</w:t>
       </w:r>
     </w:p>
     <w:p>
@@ -520,7 +560,7 @@
         </w:numPr>
       </w:pPr>
       <w:r>
-        <w:t xml:space="preserve">Light/dark theme toggle</w:t>
+        <w:t>Light/dark theme toggle</w:t>
       </w:r>
     </w:p>
     <w:p>
@@ -532,7 +572,7 @@
         </w:numPr>
       </w:pPr>
       <w:r>
-        <w:t xml:space="preserve">Loading and error states for all API calls</w:t>
+        <w:t>Loading and error states for all API calls</w:t>
       </w:r>
     </w:p>
     <w:p>
@@ -544,7 +584,7 @@
         </w:numPr>
       </w:pPr>
       <w:r>
-        <w:t xml:space="preserve">Basic abuse protection (rate limiting per IP on backend)</w:t>
+        <w:t>Basic abuse protection (rate limiting per IP on backend)</w:t>
       </w:r>
     </w:p>
     <w:p>
@@ -556,7 +596,7 @@
         </w:numPr>
       </w:pPr>
       <w:r>
-        <w:t xml:space="preserve">Built as a React single-page application</w:t>
+        <w:t>Built as a React single-page application</w:t>
       </w:r>
     </w:p>
     <w:p>
@@ -564,7 +604,7 @@
         <w:pStyle w:val="Heading3"/>
       </w:pPr>
       <w:r>
-        <w:t xml:space="preserve">Out of Scope</w:t>
+        <w:t>Out of Scope</w:t>
       </w:r>
     </w:p>
     <w:p>
@@ -576,7 +616,7 @@
         </w:numPr>
       </w:pPr>
       <w:r>
-        <w:t xml:space="preserve">User accounts / authentication</w:t>
+        <w:t>User accounts / authentication</w:t>
       </w:r>
     </w:p>
     <w:p>
@@ -588,7 +628,7 @@
         </w:numPr>
       </w:pPr>
       <w:r>
-        <w:t xml:space="preserve">Persistent server-side storage or database</w:t>
+        <w:t>Persistent server-side storage or database</w:t>
       </w:r>
     </w:p>
     <w:p>
@@ -600,7 +640,7 @@
         </w:numPr>
       </w:pPr>
       <w:r>
-        <w:t xml:space="preserve">Payment or subscription features</w:t>
+        <w:t>Payment or subscription features</w:t>
       </w:r>
     </w:p>
     <w:p>
@@ -612,7 +652,7 @@
         </w:numPr>
       </w:pPr>
       <w:r>
-        <w:t xml:space="preserve">Mobile native app (responsive web only)</w:t>
+        <w:t>Mobile native app (responsive web only)</w:t>
       </w:r>
     </w:p>
     <w:p>
@@ -624,7 +664,7 @@
         </w:numPr>
       </w:pPr>
       <w:r>
-        <w:t xml:space="preserve">Multi-language support (v1 is English only)</w:t>
+        <w:t>Multi-language support (v1 is English only)</w:t>
       </w:r>
     </w:p>
     <w:p>
@@ -639,7 +679,8 @@
         <w:pStyle w:val="Heading2"/>
       </w:pPr>
       <w:r>
-        <w:t xml:space="preserve">6. User Stories</w:t>
+        <w:lastRenderedPageBreak/>
+        <w:t>6. User Stories</w:t>
       </w:r>
     </w:p>
     <w:p>
@@ -654,10 +695,10 @@
         <w:rPr>
           <w:b/>
         </w:rPr>
-        <w:t xml:space="preserve">As a user</w:t>
-      </w:r>
-      <w:r>
-        <w:t xml:space="preserve">, I want to type in the ingredients I have so that I can get recipe ideas without searching manually.</w:t>
+        <w:t>As a user</w:t>
+      </w:r>
+      <w:r>
+        <w:t>, I want to type in the ingredients I have so that I can get recipe ideas without searching manually.</w:t>
       </w:r>
     </w:p>
     <w:p>
@@ -672,10 +713,10 @@
         <w:rPr>
           <w:b/>
         </w:rPr>
-        <w:t xml:space="preserve">As a user</w:t>
-      </w:r>
-      <w:r>
-        <w:t xml:space="preserve">, I want to filter by dietary preference so that suggestions match my diet.</w:t>
+        <w:t>As a user</w:t>
+      </w:r>
+      <w:r>
+        <w:t>, I want to filter by dietary preference so that suggestions match my diet.</w:t>
       </w:r>
     </w:p>
     <w:p>
@@ -690,10 +731,10 @@
         <w:rPr>
           <w:b/>
         </w:rPr>
-        <w:t xml:space="preserve">As a user</w:t>
-      </w:r>
-      <w:r>
-        <w:t xml:space="preserve">, I want to adjust the number of servings so that ingredient quantities scale automatically.</w:t>
+        <w:t>As a user</w:t>
+      </w:r>
+      <w:r>
+        <w:t>, I want to adjust the number of servings so that ingredient quantities scale automatically.</w:t>
       </w:r>
     </w:p>
     <w:p>
@@ -708,10 +749,10 @@
         <w:rPr>
           <w:b/>
         </w:rPr>
-        <w:t xml:space="preserve">As a user</w:t>
-      </w:r>
-      <w:r>
-        <w:t xml:space="preserve">, I want to see a relevant photo for each suggested recipe so I can judge it at a glance.</w:t>
+        <w:t>As a user</w:t>
+      </w:r>
+      <w:r>
+        <w:t>, I want to see a relevant photo for each suggested recipe so I can judge it at a glance.</w:t>
       </w:r>
     </w:p>
     <w:p>
@@ -726,10 +767,10 @@
         <w:rPr>
           <w:b/>
         </w:rPr>
-        <w:t xml:space="preserve">As a user</w:t>
-      </w:r>
-      <w:r>
-        <w:t xml:space="preserve">, I want to save a recipe I like so that I can find it again later without re-generating it.</w:t>
+        <w:t>As a user</w:t>
+      </w:r>
+      <w:r>
+        <w:t>, I want to save a recipe I like so that I can find it again later without re-generating it.</w:t>
       </w:r>
     </w:p>
     <w:p>
@@ -744,10 +785,10 @@
         <w:rPr>
           <w:b/>
         </w:rPr>
-        <w:t xml:space="preserve">As a user</w:t>
-      </w:r>
-      <w:r>
-        <w:t xml:space="preserve">, I want to see a loading indicator and a friendly error message if a service is slow or fails.</w:t>
+        <w:t>As a user</w:t>
+      </w:r>
+      <w:r>
+        <w:t>, I want to see a loading indicator and a friendly error message if a service is slow or fails.</w:t>
       </w:r>
     </w:p>
     <w:p>
@@ -762,10 +803,10 @@
         <w:rPr>
           <w:b/>
         </w:rPr>
-        <w:t xml:space="preserve">As a user</w:t>
-      </w:r>
-      <w:r>
-        <w:t xml:space="preserve">, I want to toggle dark mode for comfortable viewing at night.</w:t>
+        <w:t>As a user</w:t>
+      </w:r>
+      <w:r>
+        <w:t>, I want to toggle dark mode for comfortable viewing at night.</w:t>
       </w:r>
     </w:p>
     <w:p>
@@ -780,7 +821,7 @@
         <w:pStyle w:val="Heading2"/>
       </w:pPr>
       <w:r>
-        <w:t xml:space="preserve">7. Functional Requirements</w:t>
+        <w:t>7. Functional Requirements</w:t>
       </w:r>
     </w:p>
     <w:tbl>
@@ -788,7 +829,7 @@
         <w:tblStyle w:val="TableGrid"/>
         <w:tblW w:w="0" w:type="auto"/>
         <w:tblLayout w:type="fixed"/>
-        <w:tblLook w:val="04A0" w:firstRow="1" w:lastRow="0" w:firstColumn="0" w:lastColumn="0" w:noHBand="0" w:noVBand="1"/>
+        <w:tblLook w:val="0420" w:firstRow="1" w:lastRow="0" w:firstColumn="0" w:lastColumn="0" w:noHBand="0" w:noVBand="1"/>
       </w:tblPr>
       <w:tblGrid>
         <w:gridCol w:w="4680"/>
@@ -804,9 +845,8 @@
             <w:shd w:val="clear" w:color="auto" w:fill="F2F2F2"/>
           </w:tcPr>
           <w:p>
-            <w:pPr/>
-            <w:r>
-              <w:t xml:space="preserve">ID</w:t>
+            <w:r>
+              <w:t>ID</w:t>
             </w:r>
           </w:p>
         </w:tc>
@@ -816,9 +856,8 @@
             <w:shd w:val="clear" w:color="auto" w:fill="F2F2F2"/>
           </w:tcPr>
           <w:p>
-            <w:pPr/>
-            <w:r>
-              <w:t xml:space="preserve">Requirement</w:t>
+            <w:r>
+              <w:t>Requirement</w:t>
             </w:r>
           </w:p>
         </w:tc>
@@ -829,20 +868,18 @@
             <w:tcW w:w="4680" w:type="dxa"/>
           </w:tcPr>
           <w:p>
-            <w:pPr/>
-            <w:r>
-              <w:t xml:space="preserve">FR1</w:t>
-            </w:r>
-          </w:p>
-        </w:tc>
-        <w:tc>
-          <w:tcPr>
-            <w:tcW w:w="4680" w:type="dxa"/>
-          </w:tcPr>
-          <w:p>
-            <w:pPr/>
-            <w:r>
-              <w:t xml:space="preserve">User can input a comma-separated list of ingredients via a text field</w:t>
+            <w:r>
+              <w:t>FR1</w:t>
+            </w:r>
+          </w:p>
+        </w:tc>
+        <w:tc>
+          <w:tcPr>
+            <w:tcW w:w="4680" w:type="dxa"/>
+          </w:tcPr>
+          <w:p>
+            <w:r>
+              <w:t>User can input a comma-separated list of ingredients via a text field</w:t>
             </w:r>
           </w:p>
         </w:tc>
@@ -853,20 +890,18 @@
             <w:tcW w:w="4680" w:type="dxa"/>
           </w:tcPr>
           <w:p>
-            <w:pPr/>
-            <w:r>
-              <w:t xml:space="preserve">FR2</w:t>
-            </w:r>
-          </w:p>
-        </w:tc>
-        <w:tc>
-          <w:tcPr>
-            <w:tcW w:w="4680" w:type="dxa"/>
-          </w:tcPr>
-          <w:p>
-            <w:pPr/>
-            <w:r>
-              <w:t xml:space="preserve">User can select a dietary filter from a dropdown (Any, Vegetarian, Vegan, Gluten-Free, Keto)</w:t>
+            <w:r>
+              <w:t>FR2</w:t>
+            </w:r>
+          </w:p>
+        </w:tc>
+        <w:tc>
+          <w:tcPr>
+            <w:tcW w:w="4680" w:type="dxa"/>
+          </w:tcPr>
+          <w:p>
+            <w:r>
+              <w:t>User can select a dietary filter from a dropdown (Any, Vegetarian, Vegan, Gluten-Free, Keto)</w:t>
             </w:r>
           </w:p>
         </w:tc>
@@ -877,20 +912,18 @@
             <w:tcW w:w="4680" w:type="dxa"/>
           </w:tcPr>
           <w:p>
-            <w:pPr/>
-            <w:r>
-              <w:t xml:space="preserve">FR3</w:t>
-            </w:r>
-          </w:p>
-        </w:tc>
-        <w:tc>
-          <w:tcPr>
-            <w:tcW w:w="4680" w:type="dxa"/>
-          </w:tcPr>
-          <w:p>
-            <w:pPr/>
-            <w:r>
-              <w:t xml:space="preserve">User can select number of servings (1–8)</w:t>
+            <w:r>
+              <w:t>FR3</w:t>
+            </w:r>
+          </w:p>
+        </w:tc>
+        <w:tc>
+          <w:tcPr>
+            <w:tcW w:w="4680" w:type="dxa"/>
+          </w:tcPr>
+          <w:p>
+            <w:r>
+              <w:t>User can select number of servings (1–8)</w:t>
             </w:r>
           </w:p>
         </w:tc>
@@ -901,18 +934,16 @@
             <w:tcW w:w="4680" w:type="dxa"/>
           </w:tcPr>
           <w:p>
-            <w:pPr/>
-            <w:r>
-              <w:t xml:space="preserve">FR4</w:t>
-            </w:r>
-          </w:p>
-        </w:tc>
-        <w:tc>
-          <w:tcPr>
-            <w:tcW w:w="4680" w:type="dxa"/>
-          </w:tcPr>
-          <w:p>
-            <w:pPr/>
+            <w:r>
+              <w:t>FR4</w:t>
+            </w:r>
+          </w:p>
+        </w:tc>
+        <w:tc>
+          <w:tcPr>
+            <w:tcW w:w="4680" w:type="dxa"/>
+          </w:tcPr>
+          <w:p>
             <w:r>
               <w:t xml:space="preserve">On submit, React frontend calls backend </w:t>
             </w:r>
@@ -920,136 +951,24 @@
               <w:rPr>
                 <w:rStyle w:val="CodeChar"/>
               </w:rPr>
-              <w:t xml:space="preserve">/api/generate-recipe</w:t>
-            </w:r>
-            <w:r>
-              <w:t xml:space="preserve"> endpoint</w:t>
-            </w:r>
-          </w:p>
-        </w:tc>
-      </w:tr>
-      <w:tr>
-        <w:tc>
-          <w:tcPr>
-            <w:tcW w:w="4680" w:type="dxa"/>
-          </w:tcPr>
-          <w:p>
-            <w:pPr/>
-            <w:r>
-              <w:t xml:space="preserve">FR5</w:t>
-            </w:r>
-          </w:p>
-        </w:tc>
-        <w:tc>
-          <w:tcPr>
-            <w:tcW w:w="4680" w:type="dxa"/>
-          </w:tcPr>
-          <w:p>
-            <w:pPr/>
-            <w:r>
-              <w:t xml:space="preserve">Backend validates input (non-empty, max length, sanitized) before calling the LLM API</w:t>
-            </w:r>
-          </w:p>
-        </w:tc>
-      </w:tr>
-      <w:tr>
-        <w:tc>
-          <w:tcPr>
-            <w:tcW w:w="4680" w:type="dxa"/>
-          </w:tcPr>
-          <w:p>
-            <w:pPr/>
-            <w:r>
-              <w:t xml:space="preserve">FR6</w:t>
-            </w:r>
-          </w:p>
-        </w:tc>
-        <w:tc>
-          <w:tcPr>
-            <w:tcW w:w="4680" w:type="dxa"/>
-          </w:tcPr>
-          <w:p>
-            <w:pPr/>
-            <w:r>
-              <w:t xml:space="preserve">Backend returns structured recipe data (title, ingredients with quantities, steps, estimated time, approx. calories, image URL)</w:t>
-            </w:r>
-          </w:p>
-        </w:tc>
-      </w:tr>
-      <w:tr>
-        <w:tc>
-          <w:tcPr>
-            <w:tcW w:w="4680" w:type="dxa"/>
-          </w:tcPr>
-          <w:p>
-            <w:pPr/>
-            <w:r>
-              <w:t xml:space="preserve">FR7</w:t>
-            </w:r>
-          </w:p>
-        </w:tc>
-        <w:tc>
-          <w:tcPr>
-            <w:tcW w:w="4680" w:type="dxa"/>
-          </w:tcPr>
-          <w:p>
-            <w:pPr/>
-            <w:r>
-              <w:t xml:space="preserve">Backend fetches a relevant photo per recipe title from an image search API and attaches the URL to the response</w:t>
-            </w:r>
-          </w:p>
-        </w:tc>
-      </w:tr>
-      <w:tr>
-        <w:tc>
-          <w:tcPr>
-            <w:tcW w:w="4680" w:type="dxa"/>
-          </w:tcPr>
-          <w:p>
-            <w:pPr/>
-            <w:r>
-              <w:t xml:space="preserve">FR8</w:t>
-            </w:r>
-          </w:p>
-        </w:tc>
-        <w:tc>
-          <w:tcPr>
-            <w:tcW w:w="4680" w:type="dxa"/>
-          </w:tcPr>
-          <w:p>
-            <w:pPr/>
-            <w:r>
-              <w:t xml:space="preserve">Frontend renders the recipe(s) as React components in a card layout, including the image</w:t>
-            </w:r>
-          </w:p>
-        </w:tc>
-      </w:tr>
-      <w:tr>
-        <w:tc>
-          <w:tcPr>
-            <w:tcW w:w="4680" w:type="dxa"/>
-          </w:tcPr>
-          <w:p>
-            <w:pPr/>
-            <w:r>
-              <w:t xml:space="preserve">FR9</w:t>
-            </w:r>
-          </w:p>
-        </w:tc>
-        <w:tc>
-          <w:tcPr>
-            <w:tcW w:w="4680" w:type="dxa"/>
-          </w:tcPr>
-          <w:p>
-            <w:pPr/>
-            <w:r>
-              <w:t xml:space="preserve">User can click "Save Recipe" to store it in </w:t>
-            </w:r>
+              <w:t>/</w:t>
+            </w:r>
+            <w:proofErr w:type="spellStart"/>
             <w:r>
               <w:rPr>
                 <w:rStyle w:val="CodeChar"/>
               </w:rPr>
-              <w:t xml:space="preserve">localStorage</w:t>
+              <w:t>api</w:t>
+            </w:r>
+            <w:proofErr w:type="spellEnd"/>
+            <w:r>
+              <w:rPr>
+                <w:rStyle w:val="CodeChar"/>
+              </w:rPr>
+              <w:t>/generate-recipe</w:t>
+            </w:r>
+            <w:r>
+              <w:t xml:space="preserve"> endpoint</w:t>
             </w:r>
           </w:p>
         </w:tc>
@@ -1060,20 +979,18 @@
             <w:tcW w:w="4680" w:type="dxa"/>
           </w:tcPr>
           <w:p>
-            <w:pPr/>
-            <w:r>
-              <w:t xml:space="preserve">FR10</w:t>
-            </w:r>
-          </w:p>
-        </w:tc>
-        <w:tc>
-          <w:tcPr>
-            <w:tcW w:w="4680" w:type="dxa"/>
-          </w:tcPr>
-          <w:p>
-            <w:pPr/>
-            <w:r>
-              <w:t xml:space="preserve">User can view/remove saved recipes from a "Favorites" tab (React route/view)</w:t>
+            <w:r>
+              <w:t>FR5</w:t>
+            </w:r>
+          </w:p>
+        </w:tc>
+        <w:tc>
+          <w:tcPr>
+            <w:tcW w:w="4680" w:type="dxa"/>
+          </w:tcPr>
+          <w:p>
+            <w:r>
+              <w:t>Backend validates input (non-empty, max length, sanitized) before calling the LLM API</w:t>
             </w:r>
           </w:p>
         </w:tc>
@@ -1084,20 +1001,18 @@
             <w:tcW w:w="4680" w:type="dxa"/>
           </w:tcPr>
           <w:p>
-            <w:pPr/>
-            <w:r>
-              <w:t xml:space="preserve">FR11</w:t>
-            </w:r>
-          </w:p>
-        </w:tc>
-        <w:tc>
-          <w:tcPr>
-            <w:tcW w:w="4680" w:type="dxa"/>
-          </w:tcPr>
-          <w:p>
-            <w:pPr/>
-            <w:r>
-              <w:t xml:space="preserve">App shows the last 5 searches (localStorage) for quick re-run</w:t>
+            <w:r>
+              <w:t>FR6</w:t>
+            </w:r>
+          </w:p>
+        </w:tc>
+        <w:tc>
+          <w:tcPr>
+            <w:tcW w:w="4680" w:type="dxa"/>
+          </w:tcPr>
+          <w:p>
+            <w:r>
+              <w:t>Backend returns structured recipe data (title, ingredients with quantities, steps, estimated time, approx. calories, image URL)</w:t>
             </w:r>
           </w:p>
         </w:tc>
@@ -1108,20 +1023,145 @@
             <w:tcW w:w="4680" w:type="dxa"/>
           </w:tcPr>
           <w:p>
-            <w:pPr/>
-            <w:r>
-              <w:t xml:space="preserve">FR12</w:t>
-            </w:r>
-          </w:p>
-        </w:tc>
-        <w:tc>
-          <w:tcPr>
-            <w:tcW w:w="4680" w:type="dxa"/>
-          </w:tcPr>
-          <w:p>
-            <w:pPr/>
-            <w:r>
-              <w:t xml:space="preserve">App displays a loading spinner during API calls and a clear error message on failure</w:t>
+            <w:r>
+              <w:t>FR7</w:t>
+            </w:r>
+          </w:p>
+        </w:tc>
+        <w:tc>
+          <w:tcPr>
+            <w:tcW w:w="4680" w:type="dxa"/>
+          </w:tcPr>
+          <w:p>
+            <w:r>
+              <w:t>Backend fetches a relevant photo per recipe title from an image search API and attaches the URL to the response</w:t>
+            </w:r>
+          </w:p>
+        </w:tc>
+      </w:tr>
+      <w:tr>
+        <w:tc>
+          <w:tcPr>
+            <w:tcW w:w="4680" w:type="dxa"/>
+          </w:tcPr>
+          <w:p>
+            <w:r>
+              <w:t>FR8</w:t>
+            </w:r>
+          </w:p>
+        </w:tc>
+        <w:tc>
+          <w:tcPr>
+            <w:tcW w:w="4680" w:type="dxa"/>
+          </w:tcPr>
+          <w:p>
+            <w:r>
+              <w:t>Frontend renders the recipe(s) as React components in a card layout, including the image</w:t>
+            </w:r>
+          </w:p>
+        </w:tc>
+      </w:tr>
+      <w:tr>
+        <w:tc>
+          <w:tcPr>
+            <w:tcW w:w="4680" w:type="dxa"/>
+          </w:tcPr>
+          <w:p>
+            <w:r>
+              <w:t>FR9</w:t>
+            </w:r>
+          </w:p>
+        </w:tc>
+        <w:tc>
+          <w:tcPr>
+            <w:tcW w:w="4680" w:type="dxa"/>
+          </w:tcPr>
+          <w:p>
+            <w:r>
+              <w:t xml:space="preserve">User can click "Save Recipe" to store it in </w:t>
+            </w:r>
+            <w:proofErr w:type="spellStart"/>
+            <w:r>
+              <w:rPr>
+                <w:rStyle w:val="CodeChar"/>
+              </w:rPr>
+              <w:t>localStorage</w:t>
+            </w:r>
+            <w:proofErr w:type="spellEnd"/>
+          </w:p>
+        </w:tc>
+      </w:tr>
+      <w:tr>
+        <w:tc>
+          <w:tcPr>
+            <w:tcW w:w="4680" w:type="dxa"/>
+          </w:tcPr>
+          <w:p>
+            <w:r>
+              <w:t>FR10</w:t>
+            </w:r>
+          </w:p>
+        </w:tc>
+        <w:tc>
+          <w:tcPr>
+            <w:tcW w:w="4680" w:type="dxa"/>
+          </w:tcPr>
+          <w:p>
+            <w:r>
+              <w:t>User can view/remove saved recipes from a "Favorites" tab (React route/view)</w:t>
+            </w:r>
+          </w:p>
+        </w:tc>
+      </w:tr>
+      <w:tr>
+        <w:tc>
+          <w:tcPr>
+            <w:tcW w:w="4680" w:type="dxa"/>
+          </w:tcPr>
+          <w:p>
+            <w:r>
+              <w:lastRenderedPageBreak/>
+              <w:t>FR11</w:t>
+            </w:r>
+          </w:p>
+        </w:tc>
+        <w:tc>
+          <w:tcPr>
+            <w:tcW w:w="4680" w:type="dxa"/>
+          </w:tcPr>
+          <w:p>
+            <w:r>
+              <w:t>App shows the last 5 searches (</w:t>
+            </w:r>
+            <w:proofErr w:type="spellStart"/>
+            <w:r>
+              <w:t>localStorage</w:t>
+            </w:r>
+            <w:proofErr w:type="spellEnd"/>
+            <w:r>
+              <w:t>) for quick re-run</w:t>
+            </w:r>
+          </w:p>
+        </w:tc>
+      </w:tr>
+      <w:tr>
+        <w:tc>
+          <w:tcPr>
+            <w:tcW w:w="4680" w:type="dxa"/>
+          </w:tcPr>
+          <w:p>
+            <w:r>
+              <w:t>FR12</w:t>
+            </w:r>
+          </w:p>
+        </w:tc>
+        <w:tc>
+          <w:tcPr>
+            <w:tcW w:w="4680" w:type="dxa"/>
+          </w:tcPr>
+          <w:p>
+            <w:r>
+              <w:t>App displays a loading spinner during API calls and a clear error message on failure</w:t>
             </w:r>
           </w:p>
         </w:tc>
@@ -1139,7 +1179,7 @@
         <w:pStyle w:val="Heading2"/>
       </w:pPr>
       <w:r>
-        <w:t xml:space="preserve">8. Non-Functional Requirements</w:t>
+        <w:t>8. Non-Functional Requirements</w:t>
       </w:r>
     </w:p>
     <w:p>
@@ -1154,7 +1194,7 @@
         <w:rPr>
           <w:b/>
         </w:rPr>
-        <w:t xml:space="preserve">Security:</w:t>
+        <w:t>Security:</w:t>
       </w:r>
       <w:r>
         <w:t xml:space="preserve"> LLM API key and image API key must be stored server-side only (</w:t>
@@ -1163,10 +1203,10 @@
         <w:rPr>
           <w:rStyle w:val="CodeChar"/>
         </w:rPr>
-        <w:t xml:space="preserve">.env</w:t>
-      </w:r>
-      <w:r>
-        <w:t xml:space="preserve">), never sent to or exposed in the browser.</w:t>
+        <w:t>.env</w:t>
+      </w:r>
+      <w:r>
+        <w:t>), never sent to or exposed in the browser.</w:t>
       </w:r>
     </w:p>
     <w:p>
@@ -1181,7 +1221,7 @@
         <w:rPr>
           <w:b/>
         </w:rPr>
-        <w:t xml:space="preserve">Performance:</w:t>
+        <w:t>Performance:</w:t>
       </w:r>
       <w:r>
         <w:t xml:space="preserve"> Identical requests (same ingredients + filters) within a short window should be served from server-side cache instead of calling the LLM/image API again.</w:t>
@@ -1199,7 +1239,7 @@
         <w:rPr>
           <w:b/>
         </w:rPr>
-        <w:t xml:space="preserve">Reliability:</w:t>
+        <w:t>Reliability:</w:t>
       </w:r>
       <w:r>
         <w:t xml:space="preserve"> Backend should handle LLM/image API timeouts or failures gracefully, with the recipe still shown even if the image fetch fails (fallback placeholder image).</w:t>
@@ -1217,7 +1257,7 @@
         <w:rPr>
           <w:b/>
         </w:rPr>
-        <w:t xml:space="preserve">Usability:</w:t>
+        <w:t>Usability:</w:t>
       </w:r>
       <w:r>
         <w:t xml:space="preserve"> Fully responsive design (mobile, tablet, desktop), built with reusable React components.</w:t>
@@ -1235,7 +1275,7 @@
         <w:rPr>
           <w:b/>
         </w:rPr>
-        <w:t xml:space="preserve">Rate Limiting:</w:t>
+        <w:t>Rate Limiting:</w:t>
       </w:r>
       <w:r>
         <w:t xml:space="preserve"> Backend should limit requests per IP (e.g., 10 requests/minute) to control API cost/abuse.</w:t>
@@ -1253,7 +1293,7 @@
         <w:rPr>
           <w:b/>
         </w:rPr>
-        <w:t xml:space="preserve">Maintainability:</w:t>
+        <w:t>Maintainability:</w:t>
       </w:r>
       <w:r>
         <w:t xml:space="preserve"> Clear separation between React components, backend routes, and external API integration logic.</w:t>
@@ -1271,7 +1311,7 @@
         <w:pStyle w:val="Heading2"/>
       </w:pPr>
       <w:r>
-        <w:t xml:space="preserve">9. UX / UI Requirements</w:t>
+        <w:t>9. UX / UI Requirements</w:t>
       </w:r>
     </w:p>
     <w:p>
@@ -1286,7 +1326,7 @@
         <w:rPr>
           <w:b/>
         </w:rPr>
-        <w:t xml:space="preserve">Home screen:</w:t>
+        <w:t>Home screen:</w:t>
       </w:r>
       <w:r>
         <w:t xml:space="preserve"> Ingredient input, dietary filter dropdown, servings selector, "Generate Recipes" button</w:t>
@@ -1304,7 +1344,7 @@
         <w:rPr>
           <w:b/>
         </w:rPr>
-        <w:t xml:space="preserve">Results screen:</w:t>
+        <w:t>Results screen:</w:t>
       </w:r>
       <w:r>
         <w:t xml:space="preserve"> Recipe cards showing photo, title, time, calories, ingredients, steps; "Save" button on each card</w:t>
@@ -1322,7 +1362,7 @@
         <w:rPr>
           <w:b/>
         </w:rPr>
-        <w:t xml:space="preserve">Favorites tab:</w:t>
+        <w:t>Favorites tab:</w:t>
       </w:r>
       <w:r>
         <w:t xml:space="preserve"> Grid of saved recipe cards (with photo) and a "Remove" option</w:t>
@@ -1340,10 +1380,18 @@
         <w:rPr>
           <w:b/>
         </w:rPr>
-        <w:t xml:space="preserve">Theme toggle:</w:t>
-      </w:r>
-      <w:r>
-        <w:t xml:space="preserve"> Persisted in localStorage, applied via a React context/provider</w:t>
+        <w:t>Theme toggle:</w:t>
+      </w:r>
+      <w:r>
+        <w:t xml:space="preserve"> Persisted in </w:t>
+      </w:r>
+      <w:proofErr w:type="spellStart"/>
+      <w:r>
+        <w:t>localStorage</w:t>
+      </w:r>
+      <w:proofErr w:type="spellEnd"/>
+      <w:r>
+        <w:t>, applied via a React context/provider</w:t>
       </w:r>
     </w:p>
     <w:p>
@@ -1358,7 +1406,7 @@
         <w:rPr>
           <w:b/>
         </w:rPr>
-        <w:t xml:space="preserve">States to design for:</w:t>
+        <w:t>States to design for:</w:t>
       </w:r>
       <w:r>
         <w:t xml:space="preserve"> empty state, loading state, error state, results state, image-failed-to-load state</w:t>
@@ -1376,7 +1424,7 @@
         <w:pStyle w:val="Heading2"/>
       </w:pPr>
       <w:r>
-        <w:t xml:space="preserve">10. Success Metrics (for this academic project)</w:t>
+        <w:t>10. Success Metrics (for this academic project)</w:t>
       </w:r>
     </w:p>
     <w:p>
@@ -1388,7 +1436,7 @@
         </w:numPr>
       </w:pPr>
       <w:r>
-        <w:t xml:space="preserve">Successfully generates relevant recipes with matching images for at least 90% of reasonable test inputs</w:t>
+        <w:t>Successfully generates relevant recipes with matching images for at least 90% of reasonable test inputs</w:t>
       </w:r>
     </w:p>
     <w:p>
@@ -1400,7 +1448,7 @@
         </w:numPr>
       </w:pPr>
       <w:r>
-        <w:t xml:space="preserve">No API key (LLM or image) ever appears in browser network requests or source</w:t>
+        <w:t>No API key (LLM or image) ever appears in browser network requests or source</w:t>
       </w:r>
     </w:p>
     <w:p>
@@ -1412,7 +1460,7 @@
         </w:numPr>
       </w:pPr>
       <w:r>
-        <w:t xml:space="preserve">App remains usable/responsive on both desktop and mobile viewports</w:t>
+        <w:t>App remains usable/responsive on both desktop and mobile viewports</w:t>
       </w:r>
     </w:p>
     <w:p>
@@ -1424,7 +1472,7 @@
         </w:numPr>
       </w:pPr>
       <w:r>
-        <w:t xml:space="preserve">Cache measurably reduces duplicate LLM/image calls during a demo (can show via console/log)</w:t>
+        <w:t>Cache measurably reduces duplicate LLM/image calls during a demo (can show via console/log)</w:t>
       </w:r>
     </w:p>
     <w:p>
@@ -1439,7 +1487,7 @@
         <w:pStyle w:val="Heading2"/>
       </w:pPr>
       <w:r>
-        <w:t xml:space="preserve">11. Assumptions &amp; Constraints</w:t>
+        <w:t>11. Assumptions &amp; Constraints</w:t>
       </w:r>
     </w:p>
     <w:p>
@@ -1451,16 +1499,18 @@
         </w:numPr>
       </w:pPr>
       <w:r>
-        <w:t xml:space="preserve">No database is used; all persistence is client-side (</w:t>
-      </w:r>
+        <w:t>No database is used; all persistence is client-side (</w:t>
+      </w:r>
+      <w:proofErr w:type="spellStart"/>
       <w:r>
         <w:rPr>
           <w:rStyle w:val="CodeChar"/>
         </w:rPr>
-        <w:t xml:space="preserve">localStorage</w:t>
-      </w:r>
-      <w:r>
-        <w:t xml:space="preserve">) or transient server-side (in-memory cache).</w:t>
+        <w:t>localStorage</w:t>
+      </w:r>
+      <w:proofErr w:type="spellEnd"/>
+      <w:r>
+        <w:t>) or transient server-side (in-memory cache).</w:t>
       </w:r>
     </w:p>
     <w:p>
@@ -1472,7 +1522,23 @@
         </w:numPr>
       </w:pPr>
       <w:r>
-        <w:t xml:space="preserve">Free-tier API keys are available for both the LLM provider and the image search provider (Unsplash/Pexels) during development and demo.</w:t>
+        <w:t>Free-tier API keys are available for both the LLM provider and the image search provider (</w:t>
+      </w:r>
+      <w:proofErr w:type="spellStart"/>
+      <w:r>
+        <w:t>Unsplash</w:t>
+      </w:r>
+      <w:proofErr w:type="spellEnd"/>
+      <w:r>
+        <w:t>/</w:t>
+      </w:r>
+      <w:proofErr w:type="spellStart"/>
+      <w:r>
+        <w:t>Pexels</w:t>
+      </w:r>
+      <w:proofErr w:type="spellEnd"/>
+      <w:r>
+        <w:t>) during development and demo.</w:t>
       </w:r>
     </w:p>
     <w:p>
@@ -1484,7 +1550,7 @@
         </w:numPr>
       </w:pPr>
       <w:r>
-        <w:t xml:space="preserve">Project is a class assignment — scale/production concerns (multi-server caching, real user auth) are acknowledged but intentionally out of scope, with reasoning documented in the TRD.</w:t>
+        <w:t>Project is a class assignment — scale/production concerns (multi-server caching, real user auth) are acknowledged but intentionally out of scope, with reasoning documented in the TRD.</w:t>
       </w:r>
     </w:p>
     <w:p>
@@ -1499,7 +1565,7 @@
         <w:pStyle w:val="Heading2"/>
       </w:pPr>
       <w:r>
-        <w:t xml:space="preserve">12. Future Scope (if asked in interview)</w:t>
+        <w:t>12. Future Scope (if asked in interview)</w:t>
       </w:r>
     </w:p>
     <w:p>
@@ -1511,7 +1577,7 @@
         </w:numPr>
       </w:pPr>
       <w:r>
-        <w:t xml:space="preserve">Add a real database (MongoDB) for persistent multi-device favorites</w:t>
+        <w:t>Add a real database (MongoDB) for persistent multi-device favorites</w:t>
       </w:r>
     </w:p>
     <w:p>
@@ -1523,7 +1589,7 @@
         </w:numPr>
       </w:pPr>
       <w:r>
-        <w:t xml:space="preserve">User accounts and login</w:t>
+        <w:t>User accounts and login</w:t>
       </w:r>
     </w:p>
     <w:p>
@@ -1535,7 +1601,15 @@
         </w:numPr>
       </w:pPr>
       <w:r>
-        <w:t xml:space="preserve">Integration with a dedicated recipe API (e.g., Spoonacular) for nutrition validation alongside the LLM</w:t>
+        <w:t xml:space="preserve">Integration with a dedicated recipe API (e.g., </w:t>
+      </w:r>
+      <w:proofErr w:type="spellStart"/>
+      <w:r>
+        <w:t>Spoonacular</w:t>
+      </w:r>
+      <w:proofErr w:type="spellEnd"/>
+      <w:r>
+        <w:t>) for nutrition validation alongside the LLM</w:t>
       </w:r>
     </w:p>
     <w:p>
@@ -1547,7 +1621,7 @@
         </w:numPr>
       </w:pPr>
       <w:r>
-        <w:t xml:space="preserve">Shopping list generation from missing ingredients</w:t>
+        <w:t>Shopping list generation from missing ingredients</w:t>
       </w:r>
     </w:p>
     <w:p>
@@ -1559,22 +1633,25 @@
         </w:numPr>
       </w:pPr>
       <w:r>
-        <w:t xml:space="preserve">Server-side rendering / Next.js migration for better SEO and load performance</w:t>
+        <w:t>Server-side rendering / Next.js migration for better SEO and load performance</w:t>
       </w:r>
     </w:p>
     <w:sectPr>
       <w:pgSz w:w="12240" w:h="15840"/>
       <w:pgMar w:top="1440" w:right="1440" w:bottom="1440" w:left="1440" w:header="720" w:footer="720" w:gutter="0"/>
+      <w:cols w:space="720"/>
     </w:sectPr>
   </w:body>
 </w:document>
 </file>
 
 <file path=word/numbering.xml><?xml version="1.0" encoding="utf-8"?>
-<w:numbering xmlns:w="http://schemas.openxmlformats.org/wordprocessingml/2006/main">
-  <w:abstractNum w:abstractNumId="0">
+<w:numbering xmlns:wpc="http://schemas.microsoft.com/office/word/2010/wordprocessingCanvas" xmlns:cx="http://schemas.microsoft.com/office/drawing/2014/chartex" xmlns:cx1="http://schemas.microsoft.com/office/drawing/2015/9/8/chartex" xmlns:cx2="http://schemas.microsoft.com/office/drawing/2015/10/21/chartex" xmlns:cx3="http://schemas.microsoft.com/office/drawing/2016/5/9/chartex" xmlns:cx4="http://schemas.microsoft.com/office/drawing/2016/5/10/chartex" xmlns:cx5="http://schemas.microsoft.com/office/drawing/2016/5/11/chartex" xmlns:cx6="http://schemas.microsoft.com/office/drawing/2016/5/12/chartex" xmlns:cx7="http://schemas.microsoft.com/office/drawing/2016/5/13/chartex" xmlns:cx8="http://schemas.microsoft.com/office/drawing/2016/5/14/chartex" xmlns:mc="http://schemas.openxmlformats.org/markup-compatibility/2006" xmlns:aink="http://schemas.microsoft.com/office/drawing/2016/ink" xmlns:am3d="http://schemas.microsoft.com/office/drawing/2017/model3d" xmlns:o="urn:schemas-microsoft-com:office:office" xmlns:oel="http://schemas.microsoft.com/office/2019/extlst" xmlns:r="http://schemas.openxmlformats.org/officeDocument/2006/relationships" xmlns:m="http://schemas.openxmlformats.org/officeDocument/2006/math" xmlns:v="urn:schemas-microsoft-com:vml" xmlns:wp14="http://schemas.microsoft.com/office/word/2010/wordprocessingDrawing" xmlns:wp="http://schemas.openxmlformats.org/drawingml/2006/wordprocessingDrawing" xmlns:w10="urn:schemas-microsoft-com:office:word" xmlns:w="http://schemas.openxmlformats.org/wordprocessingml/2006/main" xmlns:w14="http://schemas.microsoft.com/office/word/2010/wordml" xmlns:w15="http://schemas.microsoft.com/office/word/2012/wordml" xmlns:w16cex="http://schemas.microsoft.com/office/word/2018/wordml/cex" xmlns:w16cid="http://schemas.microsoft.com/office/word/2016/wordml/cid" xmlns:w16="http://schemas.microsoft.com/office/word/2018/wordml" xmlns:w16du="http://schemas.microsoft.com/office/word/2023/wordml/word16du" xmlns:w16sdtdh="http://schemas.microsoft.com/office/word/2020/wordml/sdtdatahash" xmlns:w16sdtfl="http://schemas.microsoft.com/office/word/2024/wordml/sdtformatlock" xmlns:w16se="http://schemas.microsoft.com/office/word/2015/wordml/symex" xmlns:wpg="http://schemas.microsoft.com/office/word/2010/wordprocessingGroup" xmlns:wpi="http://schemas.microsoft.com/office/word/2010/wordprocessingInk" xmlns:wne="http://schemas.microsoft.com/office/word/2006/wordml" xmlns:wps="http://schemas.microsoft.com/office/word/2010/wordprocessingShape" mc:Ignorable="w14 w15 w16se w16cid w16 w16cex w16sdtdh w16sdtfl w16du wp14">
+  <w:abstractNum w:abstractNumId="0" w15:restartNumberingAfterBreak="0">
+    <w:nsid w:val="3CCE666B"/>
     <w:multiLevelType w:val="hybridMultilevel"/>
-    <w:lvl w:ilvl="0">
+    <w:tmpl w:val="F1143B4A"/>
+    <w:lvl w:ilvl="0" w:tplc="EDD00D4C">
       <w:start w:val="1"/>
       <w:numFmt w:val="bullet"/>
       <w:lvlText w:val="•"/>
@@ -1583,7 +1660,7 @@
         <w:ind w:left="720" w:hanging="360"/>
       </w:pPr>
     </w:lvl>
-    <w:lvl w:ilvl="1">
+    <w:lvl w:ilvl="1" w:tplc="72A2256A">
       <w:start w:val="1"/>
       <w:numFmt w:val="bullet"/>
       <w:lvlText w:val="o"/>
@@ -1592,7 +1669,7 @@
         <w:ind w:left="1440" w:hanging="360"/>
       </w:pPr>
     </w:lvl>
-    <w:lvl w:ilvl="2">
+    <w:lvl w:ilvl="2" w:tplc="C64617B8">
       <w:start w:val="1"/>
       <w:numFmt w:val="bullet"/>
       <w:lvlText w:val="▪"/>
@@ -1601,7 +1678,7 @@
         <w:ind w:left="2160" w:hanging="360"/>
       </w:pPr>
     </w:lvl>
-    <w:lvl w:ilvl="3">
+    <w:lvl w:ilvl="3" w:tplc="3ED6F62C">
       <w:start w:val="1"/>
       <w:numFmt w:val="bullet"/>
       <w:lvlText w:val="•"/>
@@ -1610,7 +1687,7 @@
         <w:ind w:left="2880" w:hanging="360"/>
       </w:pPr>
     </w:lvl>
-    <w:lvl w:ilvl="4">
+    <w:lvl w:ilvl="4" w:tplc="92181A6E">
       <w:start w:val="1"/>
       <w:numFmt w:val="bullet"/>
       <w:lvlText w:val="o"/>
@@ -1619,7 +1696,7 @@
         <w:ind w:left="3600" w:hanging="360"/>
       </w:pPr>
     </w:lvl>
-    <w:lvl w:ilvl="5">
+    <w:lvl w:ilvl="5" w:tplc="75DE2AD8">
       <w:start w:val="1"/>
       <w:numFmt w:val="bullet"/>
       <w:lvlText w:val="▪"/>
@@ -1628,7 +1705,7 @@
         <w:ind w:left="4320" w:hanging="360"/>
       </w:pPr>
     </w:lvl>
-    <w:lvl w:ilvl="6">
+    <w:lvl w:ilvl="6" w:tplc="25B2A304">
       <w:start w:val="1"/>
       <w:numFmt w:val="bullet"/>
       <w:lvlText w:val="•"/>
@@ -1637,7 +1714,7 @@
         <w:ind w:left="5040" w:hanging="360"/>
       </w:pPr>
     </w:lvl>
-    <w:lvl w:ilvl="7">
+    <w:lvl w:ilvl="7" w:tplc="58FC18EE">
       <w:start w:val="1"/>
       <w:numFmt w:val="bullet"/>
       <w:lvlText w:val="o"/>
@@ -1646,7 +1723,7 @@
         <w:ind w:left="5760" w:hanging="360"/>
       </w:pPr>
     </w:lvl>
-    <w:lvl w:ilvl="8">
+    <w:lvl w:ilvl="8" w:tplc="C8B43580">
       <w:start w:val="1"/>
       <w:numFmt w:val="bullet"/>
       <w:lvlText w:val="▪"/>
@@ -1656,9 +1733,11 @@
       </w:pPr>
     </w:lvl>
   </w:abstractNum>
-  <w:abstractNum w:abstractNumId="1">
+  <w:abstractNum w:abstractNumId="1" w15:restartNumberingAfterBreak="0">
+    <w:nsid w:val="6E753D1F"/>
     <w:multiLevelType w:val="hybridMultilevel"/>
-    <w:lvl w:ilvl="0">
+    <w:tmpl w:val="3704EA92"/>
+    <w:lvl w:ilvl="0" w:tplc="9418E6AC">
       <w:start w:val="1"/>
       <w:numFmt w:val="decimal"/>
       <w:lvlText w:val="%1."/>
@@ -1667,7 +1746,7 @@
         <w:ind w:left="720" w:hanging="360"/>
       </w:pPr>
     </w:lvl>
-    <w:lvl w:ilvl="1">
+    <w:lvl w:ilvl="1" w:tplc="FE9C6E26">
       <w:start w:val="1"/>
       <w:numFmt w:val="lowerLetter"/>
       <w:lvlText w:val="%2."/>
@@ -1676,7 +1755,7 @@
         <w:ind w:left="1440" w:hanging="360"/>
       </w:pPr>
     </w:lvl>
-    <w:lvl w:ilvl="2">
+    <w:lvl w:ilvl="2" w:tplc="3ADC75D2">
       <w:start w:val="1"/>
       <w:numFmt w:val="lowerRoman"/>
       <w:lvlText w:val="%3."/>
@@ -1685,7 +1764,7 @@
         <w:ind w:left="2160" w:hanging="360"/>
       </w:pPr>
     </w:lvl>
-    <w:lvl w:ilvl="3">
+    <w:lvl w:ilvl="3" w:tplc="568A7AB6">
       <w:start w:val="1"/>
       <w:numFmt w:val="decimal"/>
       <w:lvlText w:val="%4."/>
@@ -1694,7 +1773,7 @@
         <w:ind w:left="2880" w:hanging="360"/>
       </w:pPr>
     </w:lvl>
-    <w:lvl w:ilvl="4">
+    <w:lvl w:ilvl="4" w:tplc="3A622A28">
       <w:start w:val="1"/>
       <w:numFmt w:val="lowerLetter"/>
       <w:lvlText w:val="%5."/>
@@ -1703,7 +1782,7 @@
         <w:ind w:left="3600" w:hanging="360"/>
       </w:pPr>
     </w:lvl>
-    <w:lvl w:ilvl="5">
+    <w:lvl w:ilvl="5" w:tplc="A29005FC">
       <w:start w:val="1"/>
       <w:numFmt w:val="lowerRoman"/>
       <w:lvlText w:val="%6."/>
@@ -1712,7 +1791,7 @@
         <w:ind w:left="4320" w:hanging="360"/>
       </w:pPr>
     </w:lvl>
-    <w:lvl w:ilvl="6">
+    <w:lvl w:ilvl="6" w:tplc="E90AE88C">
       <w:start w:val="1"/>
       <w:numFmt w:val="decimal"/>
       <w:lvlText w:val="%7."/>
@@ -1721,7 +1800,7 @@
         <w:ind w:left="5040" w:hanging="360"/>
       </w:pPr>
     </w:lvl>
-    <w:lvl w:ilvl="7">
+    <w:lvl w:ilvl="7" w:tplc="DCC0732E">
       <w:start w:val="1"/>
       <w:numFmt w:val="lowerLetter"/>
       <w:lvlText w:val="%8."/>
@@ -1730,7 +1809,7 @@
         <w:ind w:left="5760" w:hanging="360"/>
       </w:pPr>
     </w:lvl>
-    <w:lvl w:ilvl="8">
+    <w:lvl w:ilvl="8" w:tplc="0F20BD16">
       <w:start w:val="1"/>
       <w:numFmt w:val="lowerRoman"/>
       <w:lvlText w:val="%9."/>
@@ -1740,54 +1819,54 @@
       </w:pPr>
     </w:lvl>
   </w:abstractNum>
-  <w:num w:numId="1">
+  <w:num w:numId="1" w16cid:durableId="458036842">
     <w:abstractNumId w:val="0"/>
   </w:num>
-  <w:num w:numId="2">
+  <w:num w:numId="2" w16cid:durableId="584728515">
     <w:abstractNumId w:val="0"/>
   </w:num>
-  <w:num w:numId="3">
+  <w:num w:numId="3" w16cid:durableId="1719937230">
     <w:abstractNumId w:val="0"/>
   </w:num>
-  <w:num w:numId="4">
+  <w:num w:numId="4" w16cid:durableId="1421752204">
     <w:abstractNumId w:val="0"/>
   </w:num>
-  <w:num w:numId="5">
+  <w:num w:numId="5" w16cid:durableId="1050567660">
     <w:abstractNumId w:val="0"/>
   </w:num>
-  <w:num w:numId="6">
+  <w:num w:numId="6" w16cid:durableId="212736159">
     <w:abstractNumId w:val="1"/>
     <w:lvlOverride w:ilvl="0">
       <w:startOverride w:val="1"/>
     </w:lvlOverride>
   </w:num>
-  <w:num w:numId="7">
+  <w:num w:numId="7" w16cid:durableId="1944024869">
     <w:abstractNumId w:val="0"/>
   </w:num>
-  <w:num w:numId="8">
+  <w:num w:numId="8" w16cid:durableId="1754353584">
     <w:abstractNumId w:val="0"/>
   </w:num>
-  <w:num w:numId="9">
+  <w:num w:numId="9" w16cid:durableId="1605458602">
     <w:abstractNumId w:val="0"/>
   </w:num>
-  <w:num w:numId="10">
+  <w:num w:numId="10" w16cid:durableId="542668164">
     <w:abstractNumId w:val="0"/>
   </w:num>
-  <w:num w:numId="11">
+  <w:num w:numId="11" w16cid:durableId="999968876">
     <w:abstractNumId w:val="0"/>
   </w:num>
 </w:numbering>
 </file>
 
 <file path=word/styles.xml><?xml version="1.0" encoding="utf-8"?>
-<w:styles xmlns:w="http://schemas.openxmlformats.org/wordprocessingml/2006/main">
+<w:styles xmlns:mc="http://schemas.openxmlformats.org/markup-compatibility/2006" xmlns:r="http://schemas.openxmlformats.org/officeDocument/2006/relationships" xmlns:w="http://schemas.openxmlformats.org/wordprocessingml/2006/main" xmlns:w14="http://schemas.microsoft.com/office/word/2010/wordml" xmlns:w15="http://schemas.microsoft.com/office/word/2012/wordml" xmlns:w16cex="http://schemas.microsoft.com/office/word/2018/wordml/cex" xmlns:w16cid="http://schemas.microsoft.com/office/word/2016/wordml/cid" xmlns:w16="http://schemas.microsoft.com/office/word/2018/wordml" xmlns:w16du="http://schemas.microsoft.com/office/word/2023/wordml/word16du" xmlns:w16sdtdh="http://schemas.microsoft.com/office/word/2020/wordml/sdtdatahash" xmlns:w16sdtfl="http://schemas.microsoft.com/office/word/2024/wordml/sdtformatlock" xmlns:w16se="http://schemas.microsoft.com/office/word/2015/wordml/symex" mc:Ignorable="w14 w15 w16se w16cid w16 w16cex w16sdtdh w16sdtfl w16du">
   <w:docDefaults>
     <w:rPrDefault>
       <w:rPr>
-        <w:rFonts w:ascii="Calibri" w:hAnsi="Calibri" w:eastAsia="Calibri" w:cs="Calibri"/>
+        <w:rFonts w:ascii="Calibri" w:eastAsia="Calibri" w:hAnsi="Calibri" w:cs="Calibri"/>
         <w:sz w:val="22"/>
         <w:szCs w:val="22"/>
-        <w:lang w:val="en-US"/>
+        <w:lang w:val="en-US" w:eastAsia="en-IN" w:bidi="ar-SA"/>
       </w:rPr>
     </w:rPrDefault>
     <w:pPrDefault>
@@ -1796,6 +1875,384 @@
       </w:pPr>
     </w:pPrDefault>
   </w:docDefaults>
+  <w:latentStyles w:defLockedState="0" w:defUIPriority="99" w:defSemiHidden="0" w:defUnhideWhenUsed="0" w:defQFormat="0" w:count="376">
+    <w:lsdException w:name="Normal" w:uiPriority="0" w:qFormat="1"/>
+    <w:lsdException w:name="heading 1" w:uiPriority="9" w:qFormat="1"/>
+    <w:lsdException w:name="heading 2" w:semiHidden="1" w:uiPriority="9" w:unhideWhenUsed="1" w:qFormat="1"/>
+    <w:lsdException w:name="heading 3" w:semiHidden="1" w:uiPriority="9" w:unhideWhenUsed="1" w:qFormat="1"/>
+    <w:lsdException w:name="heading 4" w:semiHidden="1" w:uiPriority="9" w:unhideWhenUsed="1" w:qFormat="1"/>
+    <w:lsdException w:name="heading 5" w:semiHidden="1" w:uiPriority="9" w:unhideWhenUsed="1" w:qFormat="1"/>
+    <w:lsdException w:name="heading 6" w:semiHidden="1" w:uiPriority="9" w:unhideWhenUsed="1" w:qFormat="1"/>
+    <w:lsdException w:name="heading 7" w:semiHidden="1" w:uiPriority="9" w:unhideWhenUsed="1" w:qFormat="1"/>
+    <w:lsdException w:name="heading 8" w:semiHidden="1" w:uiPriority="9" w:unhideWhenUsed="1" w:qFormat="1"/>
+    <w:lsdException w:name="heading 9" w:semiHidden="1" w:uiPriority="9" w:unhideWhenUsed="1" w:qFormat="1"/>
+    <w:lsdException w:name="index 1" w:semiHidden="1" w:unhideWhenUsed="1"/>
+    <w:lsdException w:name="index 2" w:semiHidden="1" w:unhideWhenUsed="1"/>
+    <w:lsdException w:name="index 3" w:semiHidden="1" w:unhideWhenUsed="1"/>
+    <w:lsdException w:name="index 4" w:semiHidden="1" w:unhideWhenUsed="1"/>
+    <w:lsdException w:name="index 5" w:semiHidden="1" w:unhideWhenUsed="1"/>
+    <w:lsdException w:name="index 6" w:semiHidden="1" w:unhideWhenUsed="1"/>
+    <w:lsdException w:name="index 7" w:semiHidden="1" w:unhideWhenUsed="1"/>
+    <w:lsdException w:name="index 8" w:semiHidden="1" w:unhideWhenUsed="1"/>
+    <w:lsdException w:name="index 9" w:semiHidden="1" w:unhideWhenUsed="1"/>
+    <w:lsdException w:name="toc 1" w:semiHidden="1" w:uiPriority="39" w:unhideWhenUsed="1"/>
+    <w:lsdException w:name="toc 2" w:semiHidden="1" w:uiPriority="39" w:unhideWhenUsed="1"/>
+    <w:lsdException w:name="toc 3" w:semiHidden="1" w:uiPriority="39" w:unhideWhenUsed="1"/>
+    <w:lsdException w:name="toc 4" w:semiHidden="1" w:uiPriority="39" w:unhideWhenUsed="1"/>
+    <w:lsdException w:name="toc 5" w:semiHidden="1" w:uiPriority="39" w:unhideWhenUsed="1"/>
+    <w:lsdException w:name="toc 6" w:semiHidden="1" w:uiPriority="39" w:unhideWhenUsed="1"/>
+    <w:lsdException w:name="toc 7" w:semiHidden="1" w:uiPriority="39" w:unhideWhenUsed="1"/>
+    <w:lsdException w:name="toc 8" w:semiHidden="1" w:uiPriority="39" w:unhideWhenUsed="1"/>
+    <w:lsdException w:name="toc 9" w:semiHidden="1" w:uiPriority="39" w:unhideWhenUsed="1"/>
+    <w:lsdException w:name="Normal Indent" w:semiHidden="1" w:unhideWhenUsed="1"/>
+    <w:lsdException w:name="footnote text" w:semiHidden="1" w:unhideWhenUsed="1"/>
+    <w:lsdException w:name="annotation text" w:semiHidden="1" w:unhideWhenUsed="1"/>
+    <w:lsdException w:name="header" w:semiHidden="1" w:unhideWhenUsed="1"/>
+    <w:lsdException w:name="footer" w:semiHidden="1" w:unhideWhenUsed="1"/>
+    <w:lsdException w:name="index heading" w:semiHidden="1" w:unhideWhenUsed="1"/>
+    <w:lsdException w:name="caption" w:semiHidden="1" w:uiPriority="35" w:unhideWhenUsed="1" w:qFormat="1"/>
+    <w:lsdException w:name="table of figures" w:semiHidden="1" w:unhideWhenUsed="1"/>
+    <w:lsdException w:name="envelope address" w:semiHidden="1" w:unhideWhenUsed="1"/>
+    <w:lsdException w:name="envelope return" w:semiHidden="1" w:unhideWhenUsed="1"/>
+    <w:lsdException w:name="footnote reference" w:semiHidden="1" w:unhideWhenUsed="1"/>
+    <w:lsdException w:name="annotation reference" w:semiHidden="1" w:unhideWhenUsed="1"/>
+    <w:lsdException w:name="line number" w:semiHidden="1" w:unhideWhenUsed="1"/>
+    <w:lsdException w:name="page number" w:semiHidden="1" w:unhideWhenUsed="1"/>
+    <w:lsdException w:name="endnote reference" w:semiHidden="1" w:unhideWhenUsed="1"/>
+    <w:lsdException w:name="endnote text" w:semiHidden="1" w:unhideWhenUsed="1"/>
+    <w:lsdException w:name="table of authorities" w:semiHidden="1" w:unhideWhenUsed="1"/>
+    <w:lsdException w:name="macro" w:semiHidden="1" w:unhideWhenUsed="1"/>
+    <w:lsdException w:name="toa heading" w:semiHidden="1" w:unhideWhenUsed="1"/>
+    <w:lsdException w:name="List" w:semiHidden="1" w:unhideWhenUsed="1"/>
+    <w:lsdException w:name="List Bullet" w:semiHidden="1" w:unhideWhenUsed="1"/>
+    <w:lsdException w:name="List Number" w:semiHidden="1" w:unhideWhenUsed="1"/>
+    <w:lsdException w:name="List 2" w:semiHidden="1" w:unhideWhenUsed="1"/>
+    <w:lsdException w:name="List 3" w:semiHidden="1" w:unhideWhenUsed="1"/>
+    <w:lsdException w:name="List 4" w:semiHidden="1" w:unhideWhenUsed="1"/>
+    <w:lsdException w:name="List 5" w:semiHidden="1" w:unhideWhenUsed="1"/>
+    <w:lsdException w:name="List Bullet 2" w:semiHidden="1" w:unhideWhenUsed="1"/>
+    <w:lsdException w:name="List Bullet 3" w:semiHidden="1" w:unhideWhenUsed="1"/>
+    <w:lsdException w:name="List Bullet 4" w:semiHidden="1" w:unhideWhenUsed="1"/>
+    <w:lsdException w:name="List Bullet 5" w:semiHidden="1" w:unhideWhenUsed="1"/>
+    <w:lsdException w:name="List Number 2" w:semiHidden="1" w:unhideWhenUsed="1"/>
+    <w:lsdException w:name="List Number 3" w:semiHidden="1" w:unhideWhenUsed="1"/>
+    <w:lsdException w:name="List Number 4" w:semiHidden="1" w:unhideWhenUsed="1"/>
+    <w:lsdException w:name="List Number 5" w:semiHidden="1" w:unhideWhenUsed="1"/>
+    <w:lsdException w:name="Title" w:uiPriority="10" w:qFormat="1"/>
+    <w:lsdException w:name="Closing" w:semiHidden="1" w:unhideWhenUsed="1"/>
+    <w:lsdException w:name="Signature" w:semiHidden="1" w:unhideWhenUsed="1"/>
+    <w:lsdException w:name="Default Paragraph Font" w:semiHidden="1" w:uiPriority="1" w:unhideWhenUsed="1"/>
+    <w:lsdException w:name="Body Text" w:semiHidden="1" w:unhideWhenUsed="1"/>
+    <w:lsdException w:name="Body Text Indent" w:semiHidden="1" w:unhideWhenUsed="1"/>
+    <w:lsdException w:name="List Continue" w:semiHidden="1" w:unhideWhenUsed="1"/>
+    <w:lsdException w:name="List Continue 2" w:semiHidden="1" w:unhideWhenUsed="1"/>
+    <w:lsdException w:name="List Continue 3" w:semiHidden="1" w:unhideWhenUsed="1"/>
+    <w:lsdException w:name="List Continue 4" w:semiHidden="1" w:unhideWhenUsed="1"/>
+    <w:lsdException w:name="List Continue 5" w:semiHidden="1" w:unhideWhenUsed="1"/>
+    <w:lsdException w:name="Message Header" w:semiHidden="1" w:unhideWhenUsed="1"/>
+    <w:lsdException w:name="Subtitle" w:uiPriority="11" w:qFormat="1"/>
+    <w:lsdException w:name="Salutation" w:semiHidden="1" w:unhideWhenUsed="1"/>
+    <w:lsdException w:name="Date" w:semiHidden="1" w:unhideWhenUsed="1"/>
+    <w:lsdException w:name="Body Text First Indent" w:semiHidden="1" w:unhideWhenUsed="1"/>
+    <w:lsdException w:name="Body Text First Indent 2" w:semiHidden="1" w:unhideWhenUsed="1"/>
+    <w:lsdException w:name="Note Heading" w:semiHidden="1" w:unhideWhenUsed="1"/>
+    <w:lsdException w:name="Body Text 2" w:semiHidden="1" w:unhideWhenUsed="1"/>
+    <w:lsdException w:name="Body Text 3" w:semiHidden="1" w:unhideWhenUsed="1"/>
+    <w:lsdException w:name="Body Text Indent 2" w:semiHidden="1" w:unhideWhenUsed="1"/>
+    <w:lsdException w:name="Body Text Indent 3" w:semiHidden="1" w:unhideWhenUsed="1"/>
+    <w:lsdException w:name="Block Text" w:semiHidden="1" w:unhideWhenUsed="1"/>
+    <w:lsdException w:name="Hyperlink" w:semiHidden="1" w:unhideWhenUsed="1"/>
+    <w:lsdException w:name="FollowedHyperlink" w:semiHidden="1" w:unhideWhenUsed="1"/>
+    <w:lsdException w:name="Strong" w:uiPriority="22" w:qFormat="1"/>
+    <w:lsdException w:name="Emphasis" w:uiPriority="20" w:qFormat="1"/>
+    <w:lsdException w:name="Document Map" w:semiHidden="1" w:unhideWhenUsed="1"/>
+    <w:lsdException w:name="Plain Text" w:semiHidden="1" w:unhideWhenUsed="1"/>
+    <w:lsdException w:name="E-mail Signature" w:semiHidden="1" w:unhideWhenUsed="1"/>
+    <w:lsdException w:name="HTML Top of Form" w:semiHidden="1" w:unhideWhenUsed="1"/>
+    <w:lsdException w:name="HTML Bottom of Form" w:semiHidden="1" w:unhideWhenUsed="1"/>
+    <w:lsdException w:name="Normal (Web)" w:semiHidden="1" w:unhideWhenUsed="1"/>
+    <w:lsdException w:name="HTML Acronym" w:semiHidden="1" w:unhideWhenUsed="1"/>
+    <w:lsdException w:name="HTML Address" w:semiHidden="1" w:unhideWhenUsed="1"/>
+    <w:lsdException w:name="HTML Cite" w:semiHidden="1" w:unhideWhenUsed="1"/>
+    <w:lsdException w:name="HTML Code" w:semiHidden="1" w:unhideWhenUsed="1"/>
+    <w:lsdException w:name="HTML Definition" w:semiHidden="1" w:unhideWhenUsed="1"/>
+    <w:lsdException w:name="HTML Keyboard" w:semiHidden="1" w:unhideWhenUsed="1"/>
+    <w:lsdException w:name="HTML Preformatted" w:semiHidden="1" w:unhideWhenUsed="1"/>
+    <w:lsdException w:name="HTML Sample" w:semiHidden="1" w:unhideWhenUsed="1"/>
+    <w:lsdException w:name="HTML Typewriter" w:semiHidden="1" w:unhideWhenUsed="1"/>
+    <w:lsdException w:name="HTML Variable" w:semiHidden="1" w:unhideWhenUsed="1"/>
+    <w:lsdException w:name="Normal Table" w:semiHidden="1" w:unhideWhenUsed="1"/>
+    <w:lsdException w:name="annotation subject" w:semiHidden="1" w:unhideWhenUsed="1"/>
+    <w:lsdException w:name="No List" w:semiHidden="1" w:unhideWhenUsed="1"/>
+    <w:lsdException w:name="Outline List 1" w:semiHidden="1" w:unhideWhenUsed="1"/>
+    <w:lsdException w:name="Outline List 2" w:semiHidden="1" w:unhideWhenUsed="1"/>
+    <w:lsdException w:name="Outline List 3" w:semiHidden="1" w:unhideWhenUsed="1"/>
+    <w:lsdException w:name="Table Simple 1" w:semiHidden="1" w:unhideWhenUsed="1"/>
+    <w:lsdException w:name="Table Simple 2" w:semiHidden="1" w:unhideWhenUsed="1"/>
+    <w:lsdException w:name="Table Simple 3" w:semiHidden="1" w:unhideWhenUsed="1"/>
+    <w:lsdException w:name="Table Classic 1" w:semiHidden="1" w:unhideWhenUsed="1"/>
+    <w:lsdException w:name="Table Classic 2" w:semiHidden="1" w:unhideWhenUsed="1"/>
+    <w:lsdException w:name="Table Classic 3" w:semiHidden="1" w:unhideWhenUsed="1"/>
+    <w:lsdException w:name="Table Classic 4" w:semiHidden="1" w:unhideWhenUsed="1"/>
+    <w:lsdException w:name="Table Colorful 1" w:semiHidden="1" w:unhideWhenUsed="1"/>
+    <w:lsdException w:name="Table Colorful 2" w:semiHidden="1" w:unhideWhenUsed="1"/>
+    <w:lsdException w:name="Table Colorful 3" w:semiHidden="1" w:unhideWhenUsed="1"/>
+    <w:lsdException w:name="Table Columns 1" w:semiHidden="1" w:unhideWhenUsed="1"/>
+    <w:lsdException w:name="Table Columns 2" w:semiHidden="1" w:unhideWhenUsed="1"/>
+    <w:lsdException w:name="Table Columns 3" w:semiHidden="1" w:unhideWhenUsed="1"/>
+    <w:lsdException w:name="Table Columns 4" w:semiHidden="1" w:unhideWhenUsed="1"/>
+    <w:lsdException w:name="Table Columns 5" w:semiHidden="1" w:unhideWhenUsed="1"/>
+    <w:lsdException w:name="Table Grid 1" w:semiHidden="1" w:unhideWhenUsed="1"/>
+    <w:lsdException w:name="Table Grid 2" w:semiHidden="1" w:unhideWhenUsed="1"/>
+    <w:lsdException w:name="Table Grid 3" w:semiHidden="1" w:unhideWhenUsed="1"/>
+    <w:lsdException w:name="Table Grid 4" w:semiHidden="1" w:unhideWhenUsed="1"/>
+    <w:lsdException w:name="Table Grid 5" w:semiHidden="1" w:unhideWhenUsed="1"/>
+    <w:lsdException w:name="Table Grid 6" w:semiHidden="1" w:unhideWhenUsed="1"/>
+    <w:lsdException w:name="Table Grid 7" w:semiHidden="1" w:unhideWhenUsed="1"/>
+    <w:lsdException w:name="Table Grid 8" w:semiHidden="1" w:unhideWhenUsed="1"/>
+    <w:lsdException w:name="Table List 1" w:semiHidden="1" w:unhideWhenUsed="1"/>
+    <w:lsdException w:name="Table List 2" w:semiHidden="1" w:unhideWhenUsed="1"/>
+    <w:lsdException w:name="Table List 3" w:semiHidden="1" w:unhideWhenUsed="1"/>
+    <w:lsdException w:name="Table List 4" w:semiHidden="1" w:unhideWhenUsed="1"/>
+    <w:lsdException w:name="Table List 5" w:semiHidden="1" w:unhideWhenUsed="1"/>
+    <w:lsdException w:name="Table List 6" w:semiHidden="1" w:unhideWhenUsed="1"/>
+    <w:lsdException w:name="Table List 7" w:semiHidden="1" w:unhideWhenUsed="1"/>
+    <w:lsdException w:name="Table List 8" w:semiHidden="1" w:unhideWhenUsed="1"/>
+    <w:lsdException w:name="Table 3D effects 1" w:semiHidden="1" w:unhideWhenUsed="1"/>
+    <w:lsdException w:name="Table 3D effects 2" w:semiHidden="1" w:unhideWhenUsed="1"/>
+    <w:lsdException w:name="Table 3D effects 3" w:semiHidden="1" w:unhideWhenUsed="1"/>
+    <w:lsdException w:name="Table Contemporary" w:semiHidden="1" w:unhideWhenUsed="1"/>
+    <w:lsdException w:name="Table Elegant" w:semiHidden="1" w:unhideWhenUsed="1"/>
+    <w:lsdException w:name="Table Professional" w:semiHidden="1" w:unhideWhenUsed="1"/>
+    <w:lsdException w:name="Table Subtle 1" w:semiHidden="1" w:unhideWhenUsed="1"/>
+    <w:lsdException w:name="Table Subtle 2" w:semiHidden="1" w:unhideWhenUsed="1"/>
+    <w:lsdException w:name="Table Web 1" w:semiHidden="1" w:unhideWhenUsed="1"/>
+    <w:lsdException w:name="Table Web 2" w:semiHidden="1" w:unhideWhenUsed="1"/>
+    <w:lsdException w:name="Table Web 3" w:semiHidden="1" w:unhideWhenUsed="1"/>
+    <w:lsdException w:name="Balloon Text" w:semiHidden="1" w:unhideWhenUsed="1"/>
+    <w:lsdException w:name="Table Grid" w:uiPriority="39"/>
+    <w:lsdException w:name="Table Theme" w:semiHidden="1" w:unhideWhenUsed="1"/>
+    <w:lsdException w:name="Placeholder Text" w:semiHidden="1"/>
+    <w:lsdException w:name="No Spacing" w:uiPriority="1" w:qFormat="1"/>
+    <w:lsdException w:name="Light Shading" w:uiPriority="60"/>
+    <w:lsdException w:name="Light List" w:uiPriority="61"/>
+    <w:lsdException w:name="Light Grid" w:uiPriority="62"/>
+    <w:lsdException w:name="Medium Shading 1" w:uiPriority="63"/>
+    <w:lsdException w:name="Medium Shading 2" w:uiPriority="64"/>
+    <w:lsdException w:name="Medium List 1" w:uiPriority="65"/>
+    <w:lsdException w:name="Medium List 2" w:uiPriority="66"/>
+    <w:lsdException w:name="Medium Grid 1" w:uiPriority="67"/>
+    <w:lsdException w:name="Medium Grid 2" w:uiPriority="68"/>
+    <w:lsdException w:name="Medium Grid 3" w:uiPriority="69"/>
+    <w:lsdException w:name="Dark List" w:uiPriority="70"/>
+    <w:lsdException w:name="Colorful Shading" w:uiPriority="71"/>
+    <w:lsdException w:name="Colorful List" w:uiPriority="72"/>
+    <w:lsdException w:name="Colorful Grid" w:uiPriority="73"/>
+    <w:lsdException w:name="Light Shading Accent 1" w:uiPriority="60"/>
+    <w:lsdException w:name="Light List Accent 1" w:uiPriority="61"/>
+    <w:lsdException w:name="Light Grid Accent 1" w:uiPriority="62"/>
+    <w:lsdException w:name="Medium Shading 1 Accent 1" w:uiPriority="63"/>
+    <w:lsdException w:name="Medium Shading 2 Accent 1" w:uiPriority="64"/>
+    <w:lsdException w:name="Medium List 1 Accent 1" w:uiPriority="65"/>
+    <w:lsdException w:name="Revision" w:semiHidden="1"/>
+    <w:lsdException w:name="List Paragraph" w:uiPriority="34" w:qFormat="1"/>
+    <w:lsdException w:name="Quote" w:uiPriority="29" w:qFormat="1"/>
+    <w:lsdException w:name="Intense Quote" w:uiPriority="30" w:qFormat="1"/>
+    <w:lsdException w:name="Medium List 2 Accent 1" w:uiPriority="66"/>
+    <w:lsdException w:name="Medium Grid 1 Accent 1" w:uiPriority="67"/>
+    <w:lsdException w:name="Medium Grid 2 Accent 1" w:uiPriority="68"/>
+    <w:lsdException w:name="Medium Grid 3 Accent 1" w:uiPriority="69"/>
+    <w:lsdException w:name="Dark List Accent 1" w:uiPriority="70"/>
+    <w:lsdException w:name="Colorful Shading Accent 1" w:uiPriority="71"/>
+    <w:lsdException w:name="Colorful List Accent 1" w:uiPriority="72"/>
+    <w:lsdException w:name="Colorful Grid Accent 1" w:uiPriority="73"/>
+    <w:lsdException w:name="Light Shading Accent 2" w:uiPriority="60"/>
+    <w:lsdException w:name="Light List Accent 2" w:uiPriority="61"/>
+    <w:lsdException w:name="Light Grid Accent 2" w:uiPriority="62"/>
+    <w:lsdException w:name="Medium Shading 1 Accent 2" w:uiPriority="63"/>
+    <w:lsdException w:name="Medium Shading 2 Accent 2" w:uiPriority="64"/>
+    <w:lsdException w:name="Medium List 1 Accent 2" w:uiPriority="65"/>
+    <w:lsdException w:name="Medium List 2 Accent 2" w:uiPriority="66"/>
+    <w:lsdException w:name="Medium Grid 1 Accent 2" w:uiPriority="67"/>
+    <w:lsdException w:name="Medium Grid 2 Accent 2" w:uiPriority="68"/>
+    <w:lsdException w:name="Medium Grid 3 Accent 2" w:uiPriority="69"/>
+    <w:lsdException w:name="Dark List Accent 2" w:uiPriority="70"/>
+    <w:lsdException w:name="Colorful Shading Accent 2" w:uiPriority="71"/>
+    <w:lsdException w:name="Colorful List Accent 2" w:uiPriority="72"/>
+    <w:lsdException w:name="Colorful Grid Accent 2" w:uiPriority="73"/>
+    <w:lsdException w:name="Light Shading Accent 3" w:uiPriority="60"/>
+    <w:lsdException w:name="Light List Accent 3" w:uiPriority="61"/>
+    <w:lsdException w:name="Light Grid Accent 3" w:uiPriority="62"/>
+    <w:lsdException w:name="Medium Shading 1 Accent 3" w:uiPriority="63"/>
+    <w:lsdException w:name="Medium Shading 2 Accent 3" w:uiPriority="64"/>
+    <w:lsdException w:name="Medium List 1 Accent 3" w:uiPriority="65"/>
+    <w:lsdException w:name="Medium List 2 Accent 3" w:uiPriority="66"/>
+    <w:lsdException w:name="Medium Grid 1 Accent 3" w:uiPriority="67"/>
+    <w:lsdException w:name="Medium Grid 2 Accent 3" w:uiPriority="68"/>
+    <w:lsdException w:name="Medium Grid 3 Accent 3" w:uiPriority="69"/>
+    <w:lsdException w:name="Dark List Accent 3" w:uiPriority="70"/>
+    <w:lsdException w:name="Colorful Shading Accent 3" w:uiPriority="71"/>
+    <w:lsdException w:name="Colorful List Accent 3" w:uiPriority="72"/>
+    <w:lsdException w:name="Colorful Grid Accent 3" w:uiPriority="73"/>
+    <w:lsdException w:name="Light Shading Accent 4" w:uiPriority="60"/>
+    <w:lsdException w:name="Light List Accent 4" w:uiPriority="61"/>
+    <w:lsdException w:name="Light Grid Accent 4" w:uiPriority="62"/>
+    <w:lsdException w:name="Medium Shading 1 Accent 4" w:uiPriority="63"/>
+    <w:lsdException w:name="Medium Shading 2 Accent 4" w:uiPriority="64"/>
+    <w:lsdException w:name="Medium List 1 Accent 4" w:uiPriority="65"/>
+    <w:lsdException w:name="Medium List 2 Accent 4" w:uiPriority="66"/>
+    <w:lsdException w:name="Medium Grid 1 Accent 4" w:uiPriority="67"/>
+    <w:lsdException w:name="Medium Grid 2 Accent 4" w:uiPriority="68"/>
+    <w:lsdException w:name="Medium Grid 3 Accent 4" w:uiPriority="69"/>
+    <w:lsdException w:name="Dark List Accent 4" w:uiPriority="70"/>
+    <w:lsdException w:name="Colorful Shading Accent 4" w:uiPriority="71"/>
+    <w:lsdException w:name="Colorful List Accent 4" w:uiPriority="72"/>
+    <w:lsdException w:name="Colorful Grid Accent 4" w:uiPriority="73"/>
+    <w:lsdException w:name="Light Shading Accent 5" w:uiPriority="60"/>
+    <w:lsdException w:name="Light List Accent 5" w:uiPriority="61"/>
+    <w:lsdException w:name="Light Grid Accent 5" w:uiPriority="62"/>
+    <w:lsdException w:name="Medium Shading 1 Accent 5" w:uiPriority="63"/>
+    <w:lsdException w:name="Medium Shading 2 Accent 5" w:uiPriority="64"/>
+    <w:lsdException w:name="Medium List 1 Accent 5" w:uiPriority="65"/>
+    <w:lsdException w:name="Medium List 2 Accent 5" w:uiPriority="66"/>
+    <w:lsdException w:name="Medium Grid 1 Accent 5" w:uiPriority="67"/>
+    <w:lsdException w:name="Medium Grid 2 Accent 5" w:uiPriority="68"/>
+    <w:lsdException w:name="Medium Grid 3 Accent 5" w:uiPriority="69"/>
+    <w:lsdException w:name="Dark List Accent 5" w:uiPriority="70"/>
+    <w:lsdException w:name="Colorful Shading Accent 5" w:uiPriority="71"/>
+    <w:lsdException w:name="Colorful List Accent 5" w:uiPriority="72"/>
+    <w:lsdException w:name="Colorful Grid Accent 5" w:uiPriority="73"/>
+    <w:lsdException w:name="Light Shading Accent 6" w:uiPriority="60"/>
+    <w:lsdException w:name="Light List Accent 6" w:uiPriority="61"/>
+    <w:lsdException w:name="Light Grid Accent 6" w:uiPriority="62"/>
+    <w:lsdException w:name="Medium Shading 1 Accent 6" w:uiPriority="63"/>
+    <w:lsdException w:name="Medium Shading 2 Accent 6" w:uiPriority="64"/>
+    <w:lsdException w:name="Medium List 1 Accent 6" w:uiPriority="65"/>
+    <w:lsdException w:name="Medium List 2 Accent 6" w:uiPriority="66"/>
+    <w:lsdException w:name="Medium Grid 1 Accent 6" w:uiPriority="67"/>
+    <w:lsdException w:name="Medium Grid 2 Accent 6" w:uiPriority="68"/>
+    <w:lsdException w:name="Medium Grid 3 Accent 6" w:uiPriority="69"/>
+    <w:lsdException w:name="Dark List Accent 6" w:uiPriority="70"/>
+    <w:lsdException w:name="Colorful Shading Accent 6" w:uiPriority="71"/>
+    <w:lsdException w:name="Colorful List Accent 6" w:uiPriority="72"/>
+    <w:lsdException w:name="Colorful Grid Accent 6" w:uiPriority="73"/>
+    <w:lsdException w:name="Subtle Emphasis" w:uiPriority="19" w:qFormat="1"/>
+    <w:lsdException w:name="Intense Emphasis" w:uiPriority="21" w:qFormat="1"/>
+    <w:lsdException w:name="Subtle Reference" w:uiPriority="31" w:qFormat="1"/>
+    <w:lsdException w:name="Intense Reference" w:uiPriority="32" w:qFormat="1"/>
+    <w:lsdException w:name="Book Title" w:uiPriority="33" w:qFormat="1"/>
+    <w:lsdException w:name="Bibliography" w:semiHidden="1" w:uiPriority="37" w:unhideWhenUsed="1"/>
+    <w:lsdException w:name="TOC Heading" w:semiHidden="1" w:uiPriority="39" w:unhideWhenUsed="1" w:qFormat="1"/>
+    <w:lsdException w:name="Plain Table 1" w:uiPriority="41"/>
+    <w:lsdException w:name="Plain Table 2" w:uiPriority="42"/>
+    <w:lsdException w:name="Plain Table 3" w:uiPriority="43"/>
+    <w:lsdException w:name="Plain Table 4" w:uiPriority="44"/>
+    <w:lsdException w:name="Plain Table 5" w:uiPriority="45"/>
+    <w:lsdException w:name="Grid Table Light" w:uiPriority="40"/>
+    <w:lsdException w:name="Grid Table 1 Light" w:uiPriority="46"/>
+    <w:lsdException w:name="Grid Table 2" w:uiPriority="47"/>
+    <w:lsdException w:name="Grid Table 3" w:uiPriority="48"/>
+    <w:lsdException w:name="Grid Table 4" w:uiPriority="49"/>
+    <w:lsdException w:name="Grid Table 5 Dark" w:uiPriority="50"/>
+    <w:lsdException w:name="Grid Table 6 Colorful" w:uiPriority="51"/>
+    <w:lsdException w:name="Grid Table 7 Colorful" w:uiPriority="52"/>
+    <w:lsdException w:name="Grid Table 1 Light Accent 1" w:uiPriority="46"/>
+    <w:lsdException w:name="Grid Table 2 Accent 1" w:uiPriority="47"/>
+    <w:lsdException w:name="Grid Table 3 Accent 1" w:uiPriority="48"/>
+    <w:lsdException w:name="Grid Table 4 Accent 1" w:uiPriority="49"/>
+    <w:lsdException w:name="Grid Table 5 Dark Accent 1" w:uiPriority="50"/>
+    <w:lsdException w:name="Grid Table 6 Colorful Accent 1" w:uiPriority="51"/>
+    <w:lsdException w:name="Grid Table 7 Colorful Accent 1" w:uiPriority="52"/>
+    <w:lsdException w:name="Grid Table 1 Light Accent 2" w:uiPriority="46"/>
+    <w:lsdException w:name="Grid Table 2 Accent 2" w:uiPriority="47"/>
+    <w:lsdException w:name="Grid Table 3 Accent 2" w:uiPriority="48"/>
+    <w:lsdException w:name="Grid Table 4 Accent 2" w:uiPriority="49"/>
+    <w:lsdException w:name="Grid Table 5 Dark Accent 2" w:uiPriority="50"/>
+    <w:lsdException w:name="Grid Table 6 Colorful Accent 2" w:uiPriority="51"/>
+    <w:lsdException w:name="Grid Table 7 Colorful Accent 2" w:uiPriority="52"/>
+    <w:lsdException w:name="Grid Table 1 Light Accent 3" w:uiPriority="46"/>
+    <w:lsdException w:name="Grid Table 2 Accent 3" w:uiPriority="47"/>
+    <w:lsdException w:name="Grid Table 3 Accent 3" w:uiPriority="48"/>
+    <w:lsdException w:name="Grid Table 4 Accent 3" w:uiPriority="49"/>
+    <w:lsdException w:name="Grid Table 5 Dark Accent 3" w:uiPriority="50"/>
+    <w:lsdException w:name="Grid Table 6 Colorful Accent 3" w:uiPriority="51"/>
+    <w:lsdException w:name="Grid Table 7 Colorful Accent 3" w:uiPriority="52"/>
+    <w:lsdException w:name="Grid Table 1 Light Accent 4" w:uiPriority="46"/>
+    <w:lsdException w:name="Grid Table 2 Accent 4" w:uiPriority="47"/>
+    <w:lsdException w:name="Grid Table 3 Accent 4" w:uiPriority="48"/>
+    <w:lsdException w:name="Grid Table 4 Accent 4" w:uiPriority="49"/>
+    <w:lsdException w:name="Grid Table 5 Dark Accent 4" w:uiPriority="50"/>
+    <w:lsdException w:name="Grid Table 6 Colorful Accent 4" w:uiPriority="51"/>
+    <w:lsdException w:name="Grid Table 7 Colorful Accent 4" w:uiPriority="52"/>
+    <w:lsdException w:name="Grid Table 1 Light Accent 5" w:uiPriority="46"/>
+    <w:lsdException w:name="Grid Table 2 Accent 5" w:uiPriority="47"/>
+    <w:lsdException w:name="Grid Table 3 Accent 5" w:uiPriority="48"/>
+    <w:lsdException w:name="Grid Table 4 Accent 5" w:uiPriority="49"/>
+    <w:lsdException w:name="Grid Table 5 Dark Accent 5" w:uiPriority="50"/>
+    <w:lsdException w:name="Grid Table 6 Colorful Accent 5" w:uiPriority="51"/>
+    <w:lsdException w:name="Grid Table 7 Colorful Accent 5" w:uiPriority="52"/>
+    <w:lsdException w:name="Grid Table 1 Light Accent 6" w:uiPriority="46"/>
+    <w:lsdException w:name="Grid Table 2 Accent 6" w:uiPriority="47"/>
+    <w:lsdException w:name="Grid Table 3 Accent 6" w:uiPriority="48"/>
+    <w:lsdException w:name="Grid Table 4 Accent 6" w:uiPriority="49"/>
+    <w:lsdException w:name="Grid Table 5 Dark Accent 6" w:uiPriority="50"/>
+    <w:lsdException w:name="Grid Table 6 Colorful Accent 6" w:uiPriority="51"/>
+    <w:lsdException w:name="Grid Table 7 Colorful Accent 6" w:uiPriority="52"/>
+    <w:lsdException w:name="List Table 1 Light" w:uiPriority="46"/>
+    <w:lsdException w:name="List Table 2" w:uiPriority="47"/>
+    <w:lsdException w:name="List Table 3" w:uiPriority="48"/>
+    <w:lsdException w:name="List Table 4" w:uiPriority="49"/>
+    <w:lsdException w:name="List Table 5 Dark" w:uiPriority="50"/>
+    <w:lsdException w:name="List Table 6 Colorful" w:uiPriority="51"/>
+    <w:lsdException w:name="List Table 7 Colorful" w:uiPriority="52"/>
+    <w:lsdException w:name="List Table 1 Light Accent 1" w:uiPriority="46"/>
+    <w:lsdException w:name="List Table 2 Accent 1" w:uiPriority="47"/>
+    <w:lsdException w:name="List Table 3 Accent 1" w:uiPriority="48"/>
+    <w:lsdException w:name="List Table 4 Accent 1" w:uiPriority="49"/>
+    <w:lsdException w:name="List Table 5 Dark Accent 1" w:uiPriority="50"/>
+    <w:lsdException w:name="List Table 6 Colorful Accent 1" w:uiPriority="51"/>
+    <w:lsdException w:name="List Table 7 Colorful Accent 1" w:uiPriority="52"/>
+    <w:lsdException w:name="List Table 1 Light Accent 2" w:uiPriority="46"/>
+    <w:lsdException w:name="List Table 2 Accent 2" w:uiPriority="47"/>
+    <w:lsdException w:name="List Table 3 Accent 2" w:uiPriority="48"/>
+    <w:lsdException w:name="List Table 4 Accent 2" w:uiPriority="49"/>
+    <w:lsdException w:name="List Table 5 Dark Accent 2" w:uiPriority="50"/>
+    <w:lsdException w:name="List Table 6 Colorful Accent 2" w:uiPriority="51"/>
+    <w:lsdException w:name="List Table 7 Colorful Accent 2" w:uiPriority="52"/>
+    <w:lsdException w:name="List Table 1 Light Accent 3" w:uiPriority="46"/>
+    <w:lsdException w:name="List Table 2 Accent 3" w:uiPriority="47"/>
+    <w:lsdException w:name="List Table 3 Accent 3" w:uiPriority="48"/>
+    <w:lsdException w:name="List Table 4 Accent 3" w:uiPriority="49"/>
+    <w:lsdException w:name="List Table 5 Dark Accent 3" w:uiPriority="50"/>
+    <w:lsdException w:name="List Table 6 Colorful Accent 3" w:uiPriority="51"/>
+    <w:lsdException w:name="List Table 7 Colorful Accent 3" w:uiPriority="52"/>
+    <w:lsdException w:name="List Table 1 Light Accent 4" w:uiPriority="46"/>
+    <w:lsdException w:name="List Table 2 Accent 4" w:uiPriority="47"/>
+    <w:lsdException w:name="List Table 3 Accent 4" w:uiPriority="48"/>
+    <w:lsdException w:name="List Table 4 Accent 4" w:uiPriority="49"/>
+    <w:lsdException w:name="List Table 5 Dark Accent 4" w:uiPriority="50"/>
+    <w:lsdException w:name="List Table 6 Colorful Accent 4" w:uiPriority="51"/>
+    <w:lsdException w:name="List Table 7 Colorful Accent 4" w:uiPriority="52"/>
+    <w:lsdException w:name="List Table 1 Light Accent 5" w:uiPriority="46"/>
+    <w:lsdException w:name="List Table 2 Accent 5" w:uiPriority="47"/>
+    <w:lsdException w:name="List Table 3 Accent 5" w:uiPriority="48"/>
+    <w:lsdException w:name="List Table 4 Accent 5" w:uiPriority="49"/>
+    <w:lsdException w:name="List Table 5 Dark Accent 5" w:uiPriority="50"/>
+    <w:lsdException w:name="List Table 6 Colorful Accent 5" w:uiPriority="51"/>
+    <w:lsdException w:name="List Table 7 Colorful Accent 5" w:uiPriority="52"/>
+    <w:lsdException w:name="List Table 1 Light Accent 6" w:uiPriority="46"/>
+    <w:lsdException w:name="List Table 2 Accent 6" w:uiPriority="47"/>
+    <w:lsdException w:name="List Table 3 Accent 6" w:uiPriority="48"/>
+    <w:lsdException w:name="List Table 4 Accent 6" w:uiPriority="49"/>
+    <w:lsdException w:name="List Table 5 Dark Accent 6" w:uiPriority="50"/>
+    <w:lsdException w:name="List Table 6 Colorful Accent 6" w:uiPriority="51"/>
+    <w:lsdException w:name="List Table 7 Colorful Accent 6" w:uiPriority="52"/>
+    <w:lsdException w:name="Mention" w:semiHidden="1" w:unhideWhenUsed="1"/>
+    <w:lsdException w:name="Smart Hyperlink" w:semiHidden="1" w:unhideWhenUsed="1"/>
+    <w:lsdException w:name="Hashtag" w:semiHidden="1" w:unhideWhenUsed="1"/>
+    <w:lsdException w:name="Unresolved Mention" w:semiHidden="1" w:unhideWhenUsed="1"/>
+    <w:lsdException w:name="Smart Link" w:semiHidden="1" w:unhideWhenUsed="1"/>
+  </w:latentStyles>
   <w:style w:type="paragraph" w:default="1" w:styleId="Normal">
     <w:name w:val="Normal"/>
     <w:qFormat/>
@@ -1804,6 +2261,7 @@
     <w:name w:val="heading 1"/>
     <w:basedOn w:val="Normal"/>
     <w:next w:val="Normal"/>
+    <w:uiPriority w:val="9"/>
     <w:qFormat/>
     <w:pPr>
       <w:keepNext/>
@@ -1819,6 +2277,8 @@
     <w:name w:val="heading 2"/>
     <w:basedOn w:val="Normal"/>
     <w:next w:val="Normal"/>
+    <w:uiPriority w:val="9"/>
+    <w:unhideWhenUsed/>
     <w:qFormat/>
     <w:pPr>
       <w:keepNext/>
@@ -1834,6 +2294,8 @@
     <w:name w:val="heading 3"/>
     <w:basedOn w:val="Normal"/>
     <w:next w:val="Normal"/>
+    <w:uiPriority w:val="9"/>
+    <w:unhideWhenUsed/>
     <w:qFormat/>
     <w:pPr>
       <w:keepNext/>
@@ -1849,6 +2311,9 @@
     <w:name w:val="heading 4"/>
     <w:basedOn w:val="Normal"/>
     <w:next w:val="Normal"/>
+    <w:uiPriority w:val="9"/>
+    <w:semiHidden/>
+    <w:unhideWhenUsed/>
     <w:qFormat/>
     <w:pPr>
       <w:keepNext/>
@@ -1856,13 +2321,15 @@
     </w:pPr>
     <w:rPr>
       <w:b/>
-      <w:sz w:val="22"/>
     </w:rPr>
   </w:style>
   <w:style w:type="paragraph" w:styleId="Heading5">
     <w:name w:val="heading 5"/>
     <w:basedOn w:val="Normal"/>
     <w:next w:val="Normal"/>
+    <w:uiPriority w:val="9"/>
+    <w:semiHidden/>
+    <w:unhideWhenUsed/>
     <w:qFormat/>
     <w:pPr>
       <w:keepNext/>
@@ -1870,13 +2337,15 @@
     </w:pPr>
     <w:rPr>
       <w:b/>
-      <w:sz w:val="22"/>
     </w:rPr>
   </w:style>
   <w:style w:type="paragraph" w:styleId="Heading6">
     <w:name w:val="heading 6"/>
     <w:basedOn w:val="Normal"/>
     <w:next w:val="Normal"/>
+    <w:uiPriority w:val="9"/>
+    <w:semiHidden/>
+    <w:unhideWhenUsed/>
     <w:qFormat/>
     <w:pPr>
       <w:keepNext/>
@@ -1884,13 +2353,40 @@
     </w:pPr>
     <w:rPr>
       <w:i/>
-      <w:sz w:val="22"/>
     </w:rPr>
+  </w:style>
+  <w:style w:type="character" w:default="1" w:styleId="DefaultParagraphFont">
+    <w:name w:val="Default Paragraph Font"/>
+    <w:uiPriority w:val="1"/>
+    <w:semiHidden/>
+    <w:unhideWhenUsed/>
+  </w:style>
+  <w:style w:type="table" w:default="1" w:styleId="TableNormal">
+    <w:name w:val="Normal Table"/>
+    <w:uiPriority w:val="99"/>
+    <w:semiHidden/>
+    <w:unhideWhenUsed/>
+    <w:tblPr>
+      <w:tblInd w:w="0" w:type="dxa"/>
+      <w:tblCellMar>
+        <w:top w:w="0" w:type="dxa"/>
+        <w:left w:w="108" w:type="dxa"/>
+        <w:bottom w:w="0" w:type="dxa"/>
+        <w:right w:w="108" w:type="dxa"/>
+      </w:tblCellMar>
+    </w:tblPr>
+  </w:style>
+  <w:style w:type="numbering" w:default="1" w:styleId="NoList">
+    <w:name w:val="No List"/>
+    <w:uiPriority w:val="99"/>
+    <w:semiHidden/>
+    <w:unhideWhenUsed/>
   </w:style>
   <w:style w:type="paragraph" w:styleId="Title">
     <w:name w:val="Title"/>
     <w:basedOn w:val="Normal"/>
     <w:next w:val="Normal"/>
+    <w:uiPriority w:val="10"/>
     <w:qFormat/>
     <w:pPr>
       <w:spacing w:after="80"/>
@@ -1905,35 +2401,35 @@
     <w:basedOn w:val="Normal"/>
     <w:qFormat/>
     <w:pPr>
-      <w:ind w:left="720" w:right="720"/>
       <w:pBdr>
         <w:left w:val="single" w:sz="12" w:space="8" w:color="A0A0A0"/>
       </w:pBdr>
+      <w:ind w:left="720" w:right="720"/>
     </w:pPr>
     <w:rPr>
       <w:i/>
       <w:color w:val="404040"/>
     </w:rPr>
   </w:style>
-  <w:style w:type="paragraph" w:styleId="Code">
+  <w:style w:type="paragraph" w:customStyle="1" w:styleId="Code">
     <w:name w:val="Code"/>
     <w:basedOn w:val="Normal"/>
     <w:link w:val="CodeChar"/>
     <w:pPr>
+      <w:shd w:val="clear" w:color="auto" w:fill="F5F5F5"/>
       <w:spacing w:after="0" w:line="240" w:lineRule="auto"/>
       <w:contextualSpacing/>
-      <w:shd w:val="clear" w:color="auto" w:fill="F5F5F5"/>
     </w:pPr>
     <w:rPr>
-      <w:rFonts w:ascii="Consolas" w:hAnsi="Consolas" w:eastAsia="Consolas" w:cs="Consolas"/>
+      <w:rFonts w:ascii="Consolas" w:eastAsia="Consolas" w:hAnsi="Consolas" w:cs="Consolas"/>
       <w:sz w:val="20"/>
     </w:rPr>
   </w:style>
-  <w:style w:type="character" w:styleId="CodeChar">
+  <w:style w:type="character" w:customStyle="1" w:styleId="CodeChar">
     <w:name w:val="Code Char"/>
     <w:link w:val="Code"/>
     <w:rPr>
-      <w:rFonts w:ascii="Consolas" w:hAnsi="Consolas" w:eastAsia="Consolas" w:cs="Consolas"/>
+      <w:rFonts w:ascii="Consolas" w:eastAsia="Consolas" w:hAnsi="Consolas" w:cs="Consolas"/>
       <w:sz w:val="20"/>
       <w:shd w:val="clear" w:color="auto" w:fill="F5F5F5"/>
     </w:rPr>
@@ -1957,7 +2453,6 @@
   <w:style w:type="paragraph" w:styleId="CommentText">
     <w:name w:val="annotation text"/>
     <w:basedOn w:val="Normal"/>
-    <w:link w:val="CommentTextChar"/>
     <w:pPr>
       <w:spacing w:line="240" w:lineRule="auto"/>
     </w:pPr>
@@ -1972,18 +2467,6 @@
       <w:sz w:val="16"/>
       <w:szCs w:val="16"/>
     </w:rPr>
-  </w:style>
-  <w:style w:type="table" w:default="1" w:styleId="TableNormal">
-    <w:name w:val="Normal Table"/>
-    <w:tblPr>
-      <w:tblInd w:w="0" w:type="dxa"/>
-      <w:tblCellMar>
-        <w:top w:w="0" w:type="dxa"/>
-        <w:left w:w="108" w:type="dxa"/>
-        <w:bottom w:w="0" w:type="dxa"/>
-        <w:right w:w="108" w:type="dxa"/>
-      </w:tblCellMar>
-    </w:tblPr>
   </w:style>
   <w:style w:type="table" w:styleId="TableGrid">
     <w:name w:val="Table Grid"/>
@@ -2000,4 +2483,299 @@
     </w:tblPr>
   </w:style>
 </w:styles>
+</file>
+
+<file path=word/theme/theme1.xml><?xml version="1.0" encoding="utf-8"?>
+<a:theme xmlns:a="http://schemas.openxmlformats.org/drawingml/2006/main" name="Office Theme">
+  <a:themeElements>
+    <a:clrScheme name="Office">
+      <a:dk1>
+        <a:sysClr val="windowText" lastClr="000000"/>
+      </a:dk1>
+      <a:lt1>
+        <a:sysClr val="window" lastClr="FFFFFF"/>
+      </a:lt1>
+      <a:dk2>
+        <a:srgbClr val="44546A"/>
+      </a:dk2>
+      <a:lt2>
+        <a:srgbClr val="E7E6E6"/>
+      </a:lt2>
+      <a:accent1>
+        <a:srgbClr val="4472C4"/>
+      </a:accent1>
+      <a:accent2>
+        <a:srgbClr val="ED7D31"/>
+      </a:accent2>
+      <a:accent3>
+        <a:srgbClr val="A5A5A5"/>
+      </a:accent3>
+      <a:accent4>
+        <a:srgbClr val="FFC000"/>
+      </a:accent4>
+      <a:accent5>
+        <a:srgbClr val="5B9BD5"/>
+      </a:accent5>
+      <a:accent6>
+        <a:srgbClr val="70AD47"/>
+      </a:accent6>
+      <a:hlink>
+        <a:srgbClr val="0563C1"/>
+      </a:hlink>
+      <a:folHlink>
+        <a:srgbClr val="954F72"/>
+      </a:folHlink>
+    </a:clrScheme>
+    <a:fontScheme name="Office">
+      <a:majorFont>
+        <a:latin typeface="Calibri Light" panose="020F0302020204030204"/>
+        <a:ea typeface=""/>
+        <a:cs typeface=""/>
+        <a:font script="Jpan" typeface="游ゴシック Light"/>
+        <a:font script="Hang" typeface="맑은 고딕"/>
+        <a:font script="Hans" typeface="等线 Light"/>
+        <a:font script="Hant" typeface="新細明體"/>
+        <a:font script="Arab" typeface="Times New Roman"/>
+        <a:font script="Hebr" typeface="Times New Roman"/>
+        <a:font script="Thai" typeface="Angsana New"/>
+        <a:font script="Ethi" typeface="Nyala"/>
+        <a:font script="Beng" typeface="Vrinda"/>
+        <a:font script="Gujr" typeface="Shruti"/>
+        <a:font script="Khmr" typeface="MoolBoran"/>
+        <a:font script="Knda" typeface="Tunga"/>
+        <a:font script="Guru" typeface="Raavi"/>
+        <a:font script="Cans" typeface="Euphemia"/>
+        <a:font script="Cher" typeface="Plantagenet Cherokee"/>
+        <a:font script="Yiii" typeface="Microsoft Yi Baiti"/>
+        <a:font script="Tibt" typeface="Microsoft Himalaya"/>
+        <a:font script="Thaa" typeface="MV Boli"/>
+        <a:font script="Deva" typeface="Mangal"/>
+        <a:font script="Telu" typeface="Gautami"/>
+        <a:font script="Taml" typeface="Latha"/>
+        <a:font script="Syrc" typeface="Estrangelo Edessa"/>
+        <a:font script="Orya" typeface="Kalinga"/>
+        <a:font script="Mlym" typeface="Kartika"/>
+        <a:font script="Laoo" typeface="DokChampa"/>
+        <a:font script="Sinh" typeface="Iskoola Pota"/>
+        <a:font script="Mong" typeface="Mongolian Baiti"/>
+        <a:font script="Viet" typeface="Times New Roman"/>
+        <a:font script="Uigh" typeface="Microsoft Uighur"/>
+        <a:font script="Geor" typeface="Sylfaen"/>
+        <a:font script="Armn" typeface="Arial"/>
+        <a:font script="Bugi" typeface="Leelawadee UI"/>
+        <a:font script="Bopo" typeface="Microsoft JhengHei"/>
+        <a:font script="Java" typeface="Javanese Text"/>
+        <a:font script="Lisu" typeface="Segoe UI"/>
+        <a:font script="Mymr" typeface="Myanmar Text"/>
+        <a:font script="Nkoo" typeface="Ebrima"/>
+        <a:font script="Olck" typeface="Nirmala UI"/>
+        <a:font script="Osma" typeface="Ebrima"/>
+        <a:font script="Phag" typeface="Phagspa"/>
+        <a:font script="Syrn" typeface="Estrangelo Edessa"/>
+        <a:font script="Syrj" typeface="Estrangelo Edessa"/>
+        <a:font script="Syre" typeface="Estrangelo Edessa"/>
+        <a:font script="Sora" typeface="Nirmala UI"/>
+        <a:font script="Tale" typeface="Microsoft Tai Le"/>
+        <a:font script="Talu" typeface="Microsoft New Tai Lue"/>
+        <a:font script="Tfng" typeface="Ebrima"/>
+      </a:majorFont>
+      <a:minorFont>
+        <a:latin typeface="Calibri" panose="020F0502020204030204"/>
+        <a:ea typeface=""/>
+        <a:cs typeface=""/>
+        <a:font script="Jpan" typeface="游明朝"/>
+        <a:font script="Hang" typeface="맑은 고딕"/>
+        <a:font script="Hans" typeface="等线"/>
+        <a:font script="Hant" typeface="新細明體"/>
+        <a:font script="Arab" typeface="Arial"/>
+        <a:font script="Hebr" typeface="Arial"/>
+        <a:font script="Thai" typeface="Cordia New"/>
+        <a:font script="Ethi" typeface="Nyala"/>
+        <a:font script="Beng" typeface="Vrinda"/>
+        <a:font script="Gujr" typeface="Shruti"/>
+        <a:font script="Khmr" typeface="DaunPenh"/>
+        <a:font script="Knda" typeface="Tunga"/>
+        <a:font script="Guru" typeface="Raavi"/>
+        <a:font script="Cans" typeface="Euphemia"/>
+        <a:font script="Cher" typeface="Plantagenet Cherokee"/>
+        <a:font script="Yiii" typeface="Microsoft Yi Baiti"/>
+        <a:font script="Tibt" typeface="Microsoft Himalaya"/>
+        <a:font script="Thaa" typeface="MV Boli"/>
+        <a:font script="Deva" typeface="Mangal"/>
+        <a:font script="Telu" typeface="Gautami"/>
+        <a:font script="Taml" typeface="Latha"/>
+        <a:font script="Syrc" typeface="Estrangelo Edessa"/>
+        <a:font script="Orya" typeface="Kalinga"/>
+        <a:font script="Mlym" typeface="Kartika"/>
+        <a:font script="Laoo" typeface="DokChampa"/>
+        <a:font script="Sinh" typeface="Iskoola Pota"/>
+        <a:font script="Mong" typeface="Mongolian Baiti"/>
+        <a:font script="Viet" typeface="Arial"/>
+        <a:font script="Uigh" typeface="Microsoft Uighur"/>
+        <a:font script="Geor" typeface="Sylfaen"/>
+        <a:font script="Armn" typeface="Arial"/>
+        <a:font script="Bugi" typeface="Leelawadee UI"/>
+        <a:font script="Bopo" typeface="Microsoft JhengHei"/>
+        <a:font script="Java" typeface="Javanese Text"/>
+        <a:font script="Lisu" typeface="Segoe UI"/>
+        <a:font script="Mymr" typeface="Myanmar Text"/>
+        <a:font script="Nkoo" typeface="Ebrima"/>
+        <a:font script="Olck" typeface="Nirmala UI"/>
+        <a:font script="Osma" typeface="Ebrima"/>
+        <a:font script="Phag" typeface="Phagspa"/>
+        <a:font script="Syrn" typeface="Estrangelo Edessa"/>
+        <a:font script="Syrj" typeface="Estrangelo Edessa"/>
+        <a:font script="Syre" typeface="Estrangelo Edessa"/>
+        <a:font script="Sora" typeface="Nirmala UI"/>
+        <a:font script="Tale" typeface="Microsoft Tai Le"/>
+        <a:font script="Talu" typeface="Microsoft New Tai Lue"/>
+        <a:font script="Tfng" typeface="Ebrima"/>
+      </a:minorFont>
+    </a:fontScheme>
+    <a:fmtScheme name="Office">
+      <a:fillStyleLst>
+        <a:solidFill>
+          <a:schemeClr val="phClr"/>
+        </a:solidFill>
+        <a:gradFill rotWithShape="1">
+          <a:gsLst>
+            <a:gs pos="0">
+              <a:schemeClr val="phClr">
+                <a:lumMod val="110000"/>
+                <a:satMod val="105000"/>
+                <a:tint val="67000"/>
+              </a:schemeClr>
+            </a:gs>
+            <a:gs pos="50000">
+              <a:schemeClr val="phClr">
+                <a:lumMod val="105000"/>
+                <a:satMod val="103000"/>
+                <a:tint val="73000"/>
+              </a:schemeClr>
+            </a:gs>
+            <a:gs pos="100000">
+              <a:schemeClr val="phClr">
+                <a:lumMod val="105000"/>
+                <a:satMod val="109000"/>
+                <a:tint val="81000"/>
+              </a:schemeClr>
+            </a:gs>
+          </a:gsLst>
+          <a:lin ang="5400000" scaled="0"/>
+        </a:gradFill>
+        <a:gradFill rotWithShape="1">
+          <a:gsLst>
+            <a:gs pos="0">
+              <a:schemeClr val="phClr">
+                <a:satMod val="103000"/>
+                <a:lumMod val="102000"/>
+                <a:tint val="94000"/>
+              </a:schemeClr>
+            </a:gs>
+            <a:gs pos="50000">
+              <a:schemeClr val="phClr">
+                <a:satMod val="110000"/>
+                <a:lumMod val="100000"/>
+                <a:shade val="100000"/>
+              </a:schemeClr>
+            </a:gs>
+            <a:gs pos="100000">
+              <a:schemeClr val="phClr">
+                <a:lumMod val="99000"/>
+                <a:satMod val="120000"/>
+                <a:shade val="78000"/>
+              </a:schemeClr>
+            </a:gs>
+          </a:gsLst>
+          <a:lin ang="5400000" scaled="0"/>
+        </a:gradFill>
+      </a:fillStyleLst>
+      <a:lnStyleLst>
+        <a:ln w="6350" cap="flat" cmpd="sng" algn="ctr">
+          <a:solidFill>
+            <a:schemeClr val="phClr"/>
+          </a:solidFill>
+          <a:prstDash val="solid"/>
+          <a:miter lim="800000"/>
+        </a:ln>
+        <a:ln w="12700" cap="flat" cmpd="sng" algn="ctr">
+          <a:solidFill>
+            <a:schemeClr val="phClr"/>
+          </a:solidFill>
+          <a:prstDash val="solid"/>
+          <a:miter lim="800000"/>
+        </a:ln>
+        <a:ln w="19050" cap="flat" cmpd="sng" algn="ctr">
+          <a:solidFill>
+            <a:schemeClr val="phClr"/>
+          </a:solidFill>
+          <a:prstDash val="solid"/>
+          <a:miter lim="800000"/>
+        </a:ln>
+      </a:lnStyleLst>
+      <a:effectStyleLst>
+        <a:effectStyle>
+          <a:effectLst/>
+        </a:effectStyle>
+        <a:effectStyle>
+          <a:effectLst/>
+        </a:effectStyle>
+        <a:effectStyle>
+          <a:effectLst>
+            <a:outerShdw blurRad="57150" dist="19050" dir="5400000" algn="ctr" rotWithShape="0">
+              <a:srgbClr val="000000">
+                <a:alpha val="63000"/>
+              </a:srgbClr>
+            </a:outerShdw>
+          </a:effectLst>
+        </a:effectStyle>
+      </a:effectStyleLst>
+      <a:bgFillStyleLst>
+        <a:solidFill>
+          <a:schemeClr val="phClr"/>
+        </a:solidFill>
+        <a:solidFill>
+          <a:schemeClr val="phClr">
+            <a:tint val="95000"/>
+            <a:satMod val="170000"/>
+          </a:schemeClr>
+        </a:solidFill>
+        <a:gradFill rotWithShape="1">
+          <a:gsLst>
+            <a:gs pos="0">
+              <a:schemeClr val="phClr">
+                <a:tint val="93000"/>
+                <a:satMod val="150000"/>
+                <a:shade val="98000"/>
+                <a:lumMod val="102000"/>
+              </a:schemeClr>
+            </a:gs>
+            <a:gs pos="50000">
+              <a:schemeClr val="phClr">
+                <a:tint val="98000"/>
+                <a:satMod val="130000"/>
+                <a:shade val="90000"/>
+                <a:lumMod val="103000"/>
+              </a:schemeClr>
+            </a:gs>
+            <a:gs pos="100000">
+              <a:schemeClr val="phClr">
+                <a:shade val="63000"/>
+                <a:satMod val="120000"/>
+              </a:schemeClr>
+            </a:gs>
+          </a:gsLst>
+          <a:lin ang="5400000" scaled="0"/>
+        </a:gradFill>
+      </a:bgFillStyleLst>
+    </a:fmtScheme>
+  </a:themeElements>
+  <a:objectDefaults/>
+  <a:extraClrSchemeLst/>
+  <a:extLst>
+    <a:ext uri="{05A4C25C-085E-4340-85A3-A5531E510DB2}">
+      <thm15:themeFamily xmlns:thm15="http://schemas.microsoft.com/office/thememl/2012/main" name="Office Theme" id="{62F939B6-93AF-4DB8-9C6B-D6C7DFDC589F}" vid="{4A3C46E8-61CC-4603-A589-7422A47A8E4A}"/>
+    </a:ext>
+  </a:extLst>
+</a:theme>
 </file>
</xml_diff>